<commit_message>
Add Code Scanning metrics snapshots
</commit_message>
<xml_diff>
--- a/docs/guia-github-actions-e-seguranca.docx
+++ b/docs/guia-github-actions-e-seguranca.docx
@@ -48,7 +48,7 @@
         <w:t>Registro de estado:</w:t>
       </w:r>
       <w:r>
-        <w:t xml:space="preserve"> 10 de outubro de 2026</w:t>
+        <w:t xml:space="preserve"> 11 de outubro de 2026</w:t>
       </w:r>
     </w:p>
     <w:p>
@@ -379,6 +379,41 @@
             </w:r>
             <w:r>
               <w:t xml:space="preserve"> em push/PR e executa uma varredura diária ao meio-dia de Brasília.</w:t>
+            </w:r>
+          </w:p>
+        </w:tc>
+      </w:tr>
+      <w:tr>
+        <w:tc>
+          <w:tcPr>
+            <w:tcW w:type="dxa" w:w="3331"/>
+            <w:vAlign w:val="center"/>
+          </w:tcPr>
+          <w:p>
+            <w:r>
+              <w:t>Exportação de métricas do Code Scanning</w:t>
+            </w:r>
+          </w:p>
+        </w:tc>
+        <w:tc>
+          <w:tcPr>
+            <w:tcW w:type="dxa" w:w="3331"/>
+            <w:vAlign w:val="center"/>
+          </w:tcPr>
+          <w:p>
+            <w:r>
+              <w:t>Proposta no novo PR</w:t>
+            </w:r>
+          </w:p>
+        </w:tc>
+        <w:tc>
+          <w:tcPr>
+            <w:tcW w:type="dxa" w:w="3331"/>
+            <w:vAlign w:val="center"/>
+          </w:tcPr>
+          <w:p>
+            <w:r>
+              <w:t>Após a aprovação e o merge, cada execução publicará snapshots JSON/CSV como artifact do Actions, com contagens por estado/severidade, razões de dismiss e análises/categorias recentes.</w:t>
             </w:r>
           </w:p>
         </w:tc>
@@ -1272,7 +1307,324 @@
         <w:pStyle w:val="Heading2"/>
       </w:pPr>
       <w:r>
-        <w:t>D. Secret Scanning — etapa separada</w:t>
+        <w:t>D. Exportar e acompanhar métricas do Code Scanning</w:t>
+      </w:r>
+    </w:p>
+    <w:p>
+      <w:r>
+        <w:t xml:space="preserve">O job </w:t>
+      </w:r>
+      <w:r>
+        <w:rPr>
+          <w:rFonts w:ascii="Consolas" w:hAnsi="Consolas"/>
+          <w:color w:val="5B2C83"/>
+          <w:sz w:val="18"/>
+        </w:rPr>
+        <w:t>Export Code Scanning metrics</w:t>
+      </w:r>
+      <w:r>
+        <w:t xml:space="preserve">, em </w:t>
+      </w:r>
+      <w:r>
+        <w:rPr>
+          <w:rFonts w:ascii="Consolas" w:hAnsi="Consolas"/>
+          <w:color w:val="5B2C83"/>
+          <w:sz w:val="18"/>
+        </w:rPr>
+        <w:t>.github/workflows/codeql.yml</w:t>
+      </w:r>
+      <w:r>
+        <w:t xml:space="preserve">, consulta a REST API do GitHub com o </w:t>
+      </w:r>
+      <w:r>
+        <w:rPr>
+          <w:rFonts w:ascii="Consolas" w:hAnsi="Consolas"/>
+          <w:color w:val="5B2C83"/>
+          <w:sz w:val="18"/>
+        </w:rPr>
+        <w:t>GITHUB_TOKEN</w:t>
+      </w:r>
+      <w:r>
+        <w:t xml:space="preserve"> temporário da própria execução. A permissão fica limitada ao necessário: </w:t>
+      </w:r>
+      <w:r>
+        <w:rPr>
+          <w:rFonts w:ascii="Consolas" w:hAnsi="Consolas"/>
+          <w:color w:val="5B2C83"/>
+          <w:sz w:val="18"/>
+        </w:rPr>
+        <w:t>security-events: read</w:t>
+      </w:r>
+      <w:r>
+        <w:t xml:space="preserve"> para consultar alertas/análises e </w:t>
+      </w:r>
+      <w:r>
+        <w:rPr>
+          <w:rFonts w:ascii="Consolas" w:hAnsi="Consolas"/>
+          <w:color w:val="5B2C83"/>
+          <w:sz w:val="18"/>
+        </w:rPr>
+        <w:t>contents: read</w:t>
+      </w:r>
+      <w:r>
+        <w:t xml:space="preserve"> para baixar o script versionado. Não é necessário criar um Personal Access Token nem cadastrar um secret.</w:t>
+      </w:r>
+    </w:p>
+    <w:p>
+      <w:r>
+        <w:t>Para baixar um snapshot:</w:t>
+      </w:r>
+    </w:p>
+    <w:p>
+      <w:pPr>
+        <w:pStyle w:val="ListNumber"/>
+      </w:pPr>
+      <w:r>
+        <w:t xml:space="preserve">Abra </w:t>
+      </w:r>
+      <w:r>
+        <w:rPr>
+          <w:b/>
+        </w:rPr>
+        <w:t>Actions</w:t>
+      </w:r>
+      <w:r>
+        <w:t xml:space="preserve"> e escolha uma execução de </w:t>
+      </w:r>
+      <w:r>
+        <w:rPr>
+          <w:b/>
+        </w:rPr>
+        <w:t>CodeQL Advanced</w:t>
+      </w:r>
+      <w:r>
+        <w:t>.</w:t>
+      </w:r>
+    </w:p>
+    <w:p>
+      <w:pPr>
+        <w:pStyle w:val="ListNumber"/>
+      </w:pPr>
+      <w:r>
+        <w:t xml:space="preserve">Na página de resumo dessa execução, localize </w:t>
+      </w:r>
+      <w:r>
+        <w:rPr>
+          <w:b/>
+        </w:rPr>
+        <w:t>Artifacts</w:t>
+      </w:r>
+      <w:r>
+        <w:t>.</w:t>
+      </w:r>
+    </w:p>
+    <w:p>
+      <w:pPr>
+        <w:pStyle w:val="ListNumber"/>
+      </w:pPr>
+      <w:r>
+        <w:t xml:space="preserve">Baixe </w:t>
+      </w:r>
+      <w:r>
+        <w:rPr>
+          <w:rFonts w:ascii="Consolas" w:hAnsi="Consolas"/>
+          <w:color w:val="5B2C83"/>
+          <w:sz w:val="18"/>
+        </w:rPr>
+        <w:t>code-scanning-metrics-&lt;run-id&gt;-&lt;tentativa&gt;</w:t>
+      </w:r>
+      <w:r>
+        <w:t xml:space="preserve"> e extraia o ZIP.</w:t>
+      </w:r>
+    </w:p>
+    <w:p>
+      <w:pPr>
+        <w:pStyle w:val="ListNumber"/>
+      </w:pPr>
+      <w:r>
+        <w:t xml:space="preserve">Abra </w:t>
+      </w:r>
+      <w:r>
+        <w:rPr>
+          <w:rFonts w:ascii="Consolas" w:hAnsi="Consolas"/>
+          <w:color w:val="5B2C83"/>
+          <w:sz w:val="18"/>
+        </w:rPr>
+        <w:t>snapshot.json</w:t>
+      </w:r>
+      <w:r>
+        <w:t xml:space="preserve"> para os metadados/contexto, </w:t>
+      </w:r>
+      <w:r>
+        <w:rPr>
+          <w:rFonts w:ascii="Consolas" w:hAnsi="Consolas"/>
+          <w:color w:val="5B2C83"/>
+          <w:sz w:val="18"/>
+        </w:rPr>
+        <w:t>alerts-summary.csv</w:t>
+      </w:r>
+      <w:r>
+        <w:t xml:space="preserve"> para contagens por estado e severidade, </w:t>
+      </w:r>
+      <w:r>
+        <w:rPr>
+          <w:rFonts w:ascii="Consolas" w:hAnsi="Consolas"/>
+          <w:color w:val="5B2C83"/>
+          <w:sz w:val="18"/>
+        </w:rPr>
+        <w:t>dismissal-reasons.csv</w:t>
+      </w:r>
+      <w:r>
+        <w:t xml:space="preserve"> para os motivos de dismiss e </w:t>
+      </w:r>
+      <w:r>
+        <w:rPr>
+          <w:rFonts w:ascii="Consolas" w:hAnsi="Consolas"/>
+          <w:color w:val="5B2C83"/>
+          <w:sz w:val="18"/>
+        </w:rPr>
+        <w:t>analysis-configurations.csv</w:t>
+      </w:r>
+      <w:r>
+        <w:t xml:space="preserve"> para as categorias e análises registradas.</w:t>
+      </w:r>
+    </w:p>
+    <w:p>
+      <w:r>
+        <w:t>O relatório inclui timestamp UTC, branch ou número do PR, commit, link e resultado dos jobs CodeQL. Por categoria, a API informa a ferramenta/versão, horário, commit, resultados e regras executadas. Isso permite ver quais linguagens/configurações reportaram análise; a API não fornece a quantidade de arquivos-fonte examinados. Uma categoria só é evidência de análise concluída se seu commit/horário corresponderem à execução observada.</w:t>
+      </w:r>
+    </w:p>
+    <w:p>
+      <w:r>
+        <w:t xml:space="preserve">Os valores de </w:t>
+      </w:r>
+      <w:r>
+        <w:rPr>
+          <w:rFonts w:ascii="Consolas" w:hAnsi="Consolas"/>
+          <w:color w:val="5B2C83"/>
+          <w:sz w:val="18"/>
+        </w:rPr>
+        <w:t>open</w:t>
+      </w:r>
+      <w:r>
+        <w:t xml:space="preserve">, </w:t>
+      </w:r>
+      <w:r>
+        <w:rPr>
+          <w:rFonts w:ascii="Consolas" w:hAnsi="Consolas"/>
+          <w:color w:val="5B2C83"/>
+          <w:sz w:val="18"/>
+        </w:rPr>
+        <w:t>dismissed</w:t>
+      </w:r>
+      <w:r>
+        <w:t xml:space="preserve"> e </w:t>
+      </w:r>
+      <w:r>
+        <w:rPr>
+          <w:rFonts w:ascii="Consolas" w:hAnsi="Consolas"/>
+          <w:color w:val="5B2C83"/>
+          <w:sz w:val="18"/>
+        </w:rPr>
+        <w:t>fixed</w:t>
+      </w:r>
+      <w:r>
+        <w:t xml:space="preserve"> são o estado atual que a API devolve para o branch ou PR consultado naquela execução. </w:t>
+      </w:r>
+      <w:r>
+        <w:rPr>
+          <w:rFonts w:ascii="Consolas" w:hAnsi="Consolas"/>
+          <w:color w:val="5B2C83"/>
+          <w:sz w:val="18"/>
+        </w:rPr>
+        <w:t>dismissed_counts_by_reason</w:t>
+      </w:r>
+      <w:r>
+        <w:t xml:space="preserve"> é uma contagem de alertas atualmente dispensados por motivo. Comparar os artifacts ao longo do tempo mostra a evolução das contagens, mas não é um log completo de eventos de dismiss: alertas podem mudar de estado entre snapshots, e a API não oferece neste relatório o histórico de cada transição.</w:t>
+      </w:r>
+    </w:p>
+    <w:p>
+      <w:r>
+        <w:t xml:space="preserve">Os arquivos não incluem ator, comentário, local do alerta nem identificadores individuais. O artifact fica vinculado à execução e expira após 90 dias (limite máximo configurado para um repositório público). Para preservar histórico por mais tempo, será necessário aprovar outro destino de armazenamento. Se uma análise falhar, o job de métricas ainda tenta registrar o estado que a API disponibiliza; confira </w:t>
+      </w:r>
+      <w:r>
+        <w:rPr>
+          <w:rFonts w:ascii="Consolas" w:hAnsi="Consolas"/>
+          <w:color w:val="5B2C83"/>
+          <w:sz w:val="18"/>
+        </w:rPr>
+        <w:t>codeql_job_result</w:t>
+      </w:r>
+      <w:r>
+        <w:t xml:space="preserve"> e o commit/horário das categorias para não interpretar dados antigos como resultado da execução atual.</w:t>
+      </w:r>
+    </w:p>
+    <w:p>
+      <w:r>
+        <w:t xml:space="preserve">O script </w:t>
+      </w:r>
+      <w:r>
+        <w:rPr>
+          <w:rFonts w:ascii="Consolas" w:hAnsi="Consolas"/>
+          <w:color w:val="5B2C83"/>
+          <w:sz w:val="18"/>
+        </w:rPr>
+        <w:t>scripts/export_code_scanning_metrics.py</w:t>
+      </w:r>
+      <w:r>
+        <w:t xml:space="preserve"> percorre as páginas da API, agrega os alertas sem dados pessoais, seleciona a análise mais recente por categoria e grava os arquivos mencionados. Para adaptar em outro repositório, copie o script, adicione um job após a análise, conceda somente </w:t>
+      </w:r>
+      <w:r>
+        <w:rPr>
+          <w:rFonts w:ascii="Consolas" w:hAnsi="Consolas"/>
+          <w:color w:val="5B2C83"/>
+          <w:sz w:val="18"/>
+        </w:rPr>
+        <w:t>security-events: read</w:t>
+      </w:r>
+      <w:r>
+        <w:t xml:space="preserve"> e </w:t>
+      </w:r>
+      <w:r>
+        <w:rPr>
+          <w:rFonts w:ascii="Consolas" w:hAnsi="Consolas"/>
+          <w:color w:val="5B2C83"/>
+          <w:sz w:val="18"/>
+        </w:rPr>
+        <w:t>contents: read</w:t>
+      </w:r>
+      <w:r>
+        <w:t xml:space="preserve">, forneça </w:t>
+      </w:r>
+      <w:r>
+        <w:rPr>
+          <w:rFonts w:ascii="Consolas" w:hAnsi="Consolas"/>
+          <w:color w:val="5B2C83"/>
+          <w:sz w:val="18"/>
+        </w:rPr>
+        <w:t>${{ github.token }}</w:t>
+      </w:r>
+      <w:r>
+        <w:t xml:space="preserve"> como variável de ambiente e publique a pasta criada com </w:t>
+      </w:r>
+      <w:r>
+        <w:rPr>
+          <w:rFonts w:ascii="Consolas" w:hAnsi="Consolas"/>
+          <w:color w:val="5B2C83"/>
+          <w:sz w:val="18"/>
+        </w:rPr>
+        <w:t>actions/upload-artifact</w:t>
+      </w:r>
+      <w:r>
+        <w:t>. Não coloque o token em linha de comando, arquivo do repositório ou log.</w:t>
+      </w:r>
+    </w:p>
+    <w:p>
+      <w:pPr>
+        <w:pStyle w:val="Heading2"/>
+      </w:pPr>
+      <w:r>
+        <w:t>E. Secret Scanning — etapa separada</w:t>
       </w:r>
     </w:p>
     <w:p>
@@ -1545,6 +1897,14 @@
         <w:pStyle w:val="ListNumber"/>
       </w:pPr>
       <w:r>
+        <w:t>Baixar e comparar os snapshots de métricas do Code Scanning.</w:t>
+      </w:r>
+    </w:p>
+    <w:p>
+      <w:pPr>
+        <w:pStyle w:val="ListNumber"/>
+      </w:pPr>
+      <w:r>
         <w:t>Testar Dependabot isoladamente.</w:t>
       </w:r>
     </w:p>
@@ -1630,6 +1990,38 @@
         <w:pStyle w:val="ListBullet"/>
       </w:pPr>
       <w:r>
+        <w:t>REST API: alertas do Code Scanning — https://docs.github.com/en/rest/code-scanning/code-scanning#list-code-scanning-alerts-for-a-repository</w:t>
+      </w:r>
+    </w:p>
+    <w:p>
+      <w:pPr>
+        <w:pStyle w:val="ListBullet"/>
+      </w:pPr>
+      <w:r>
+        <w:t>REST API: análises do Code Scanning — https://docs.github.com/en/rest/code-scanning/code-scanning#list-code-scanning-analyses-for-a-repository</w:t>
+      </w:r>
+    </w:p>
+    <w:p>
+      <w:pPr>
+        <w:pStyle w:val="ListBullet"/>
+      </w:pPr>
+      <w:r>
+        <w:t>Permissões para o token do workflow — https://docs.github.com/en/actions/security-for-github-actions/security-guides/automatic-token-authentication</w:t>
+      </w:r>
+    </w:p>
+    <w:p>
+      <w:pPr>
+        <w:pStyle w:val="ListBullet"/>
+      </w:pPr>
+      <w:r>
+        <w:t>Retenção de artifacts do Actions — https://docs.github.com/en/actions/how-tos/manage-workflow-runs/remove-workflow-artifacts</w:t>
+      </w:r>
+    </w:p>
+    <w:p>
+      <w:pPr>
+        <w:pStyle w:val="ListBullet"/>
+      </w:pPr>
+      <w:r>
         <w:t>Quickstart de segurança do GitHub — https://docs.github.com/en/code-security/getting-started/quickstart-for-securing-your-repository</w:t>
       </w:r>
     </w:p>
@@ -1703,6 +2095,14 @@
       </w:r>
       <w:r>
         <w:t xml:space="preserve"> use o novo horário.</w:t>
+      </w:r>
+    </w:p>
+    <w:p>
+      <w:pPr>
+        <w:pStyle w:val="ListBullet"/>
+      </w:pPr>
+      <w:r>
+        <w:t>A exportação de métricas foi proposta em um PR separado após o merge do PR #11. Os artifacts passam a aparecer quando essa alteração for aprovada, mesclada e o workflow executar; cada artifact terá retenção de 90 dias.</w:t>
       </w:r>
     </w:p>
     <w:p>

</xml_diff>

<commit_message>
Use metrics workflow with managed CodeQL
</commit_message>
<xml_diff>
--- a/docs/guia-github-actions-e-seguranca.docx
+++ b/docs/guia-github-actions-e-seguranca.docx
@@ -348,7 +348,7 @@
           </w:tcPr>
           <w:p>
             <w:r>
-              <w:t>Advanced setup ativo</w:t>
+              <w:t>Default setup ativo</w:t>
             </w:r>
           </w:p>
         </w:tc>
@@ -359,26 +359,7 @@
           </w:tcPr>
           <w:p>
             <w:r>
-              <w:rPr>
-                <w:rFonts w:ascii="Consolas" w:hAnsi="Consolas"/>
-                <w:color w:val="5B2C83"/>
-                <w:sz w:val="18"/>
-              </w:rPr>
-              <w:t>.github/workflows/codeql.yml</w:t>
-            </w:r>
-            <w:r>
-              <w:t xml:space="preserve"> analisa </w:t>
-            </w:r>
-            <w:r>
-              <w:rPr>
-                <w:rFonts w:ascii="Consolas" w:hAnsi="Consolas"/>
-                <w:color w:val="5B2C83"/>
-                <w:sz w:val="18"/>
-              </w:rPr>
-              <w:t>main</w:t>
-            </w:r>
-            <w:r>
-              <w:t xml:space="preserve"> em push/PR e executa uma varredura diária ao meio-dia de Brasília.</w:t>
+              <w:t>O GitHub gerencia a análise. O workflow YAML Advanced existente aparece como disabled_manually; seu cron não agenda a análise CodeQL.</w:t>
             </w:r>
           </w:p>
         </w:tc>
@@ -402,7 +383,7 @@
           </w:tcPr>
           <w:p>
             <w:r>
-              <w:t>Proposta no novo PR</w:t>
+              <w:t>Proposta no PR #12</w:t>
             </w:r>
           </w:p>
         </w:tc>
@@ -413,7 +394,7 @@
           </w:tcPr>
           <w:p>
             <w:r>
-              <w:t>Após a aprovação e o merge, cada execução publicará snapshots JSON/CSV como artifact do Actions, com contagens por estado/severidade, razões de dismiss e análises/categorias recentes.</w:t>
+              <w:t>.github/workflows/code-scanning-metrics.yml fará snapshots diários, em push para main e em PRs após o merge do workflow; consulta o Code Scanning gerenciado pela API REST.</w:t>
             </w:r>
           </w:p>
         </w:tc>
@@ -1092,41 +1073,12 @@
         <w:pStyle w:val="Heading2"/>
       </w:pPr>
       <w:r>
-        <w:t>C. Code Scanning com CodeQL — Advanced setup ativo</w:t>
+        <w:t>C. Code Scanning com CodeQL — Default setup ativo</w:t>
       </w:r>
     </w:p>
     <w:p>
       <w:r>
-        <w:t xml:space="preserve">O workflow editável </w:t>
-      </w:r>
-      <w:r>
-        <w:rPr>
-          <w:rFonts w:ascii="Consolas" w:hAnsi="Consolas"/>
-          <w:color w:val="5B2C83"/>
-          <w:sz w:val="18"/>
-        </w:rPr>
-        <w:t>.github/workflows/codeql.yml</w:t>
-      </w:r>
-      <w:r>
-        <w:t xml:space="preserve"> foi criado pelo assistente </w:t>
-      </w:r>
-      <w:r>
-        <w:rPr>
-          <w:b/>
-        </w:rPr>
-        <w:t>Advanced setup</w:t>
-      </w:r>
-      <w:r>
-        <w:t xml:space="preserve"> do GitHub. O </w:t>
-      </w:r>
-      <w:r>
-        <w:rPr>
-          <w:b/>
-        </w:rPr>
-        <w:t>Default setup</w:t>
-      </w:r>
-      <w:r>
-        <w:t xml:space="preserve"> é administrado pela interface; Advanced setup deixa a configuração em YAML para controlar linguagens, matriz, build e eventos. A imagem do material didático compara esses dois modos; ela não é uma tela específica deste repositório.</w:t>
+        <w:t>O repositório está usando Default setup, administrado nas configurações do GitHub. O GitHub cria e executa a configuração sem depender de um workflow versionado. O YAML .github/workflows/codeql.yml é um arquivo antigo de Advanced setup; a interface informa que ele está disabled_manually porque o Default setup está ativo. Por isso, o schedule que aparece nesse YAML não executa uma análise CodeQL. A imagem do material didático compara os dois modos; ela não é uma tela específica deste repositório.</w:t>
       </w:r>
     </w:p>
     <w:p>
@@ -1179,127 +1131,12 @@
     </w:p>
     <w:p>
       <w:r>
-        <w:t xml:space="preserve">O workflow analisa pushes para </w:t>
-      </w:r>
-      <w:r>
-        <w:rPr>
-          <w:rFonts w:ascii="Consolas" w:hAnsi="Consolas"/>
-          <w:color w:val="5B2C83"/>
-          <w:sz w:val="18"/>
-        </w:rPr>
-        <w:t>main</w:t>
-      </w:r>
-      <w:r>
-        <w:t xml:space="preserve">, PRs destinados a </w:t>
-      </w:r>
-      <w:r>
-        <w:rPr>
-          <w:rFonts w:ascii="Consolas" w:hAnsi="Consolas"/>
-          <w:color w:val="5B2C83"/>
-          <w:sz w:val="18"/>
-        </w:rPr>
-        <w:t>main</w:t>
-      </w:r>
-      <w:r>
-        <w:t xml:space="preserve"> e executa uma varredura agendada todos os dias ao meio-dia no horário de Brasília (</w:t>
-      </w:r>
-      <w:r>
-        <w:rPr>
-          <w:rFonts w:ascii="Consolas" w:hAnsi="Consolas"/>
-          <w:color w:val="5B2C83"/>
-          <w:sz w:val="18"/>
-        </w:rPr>
-        <w:t>cron: '0 12 * * *'</w:t>
-      </w:r>
-      <w:r>
-        <w:t xml:space="preserve">, fuso </w:t>
-      </w:r>
-      <w:r>
-        <w:rPr>
-          <w:rFonts w:ascii="Consolas" w:hAnsi="Consolas"/>
-          <w:color w:val="5B2C83"/>
-          <w:sz w:val="18"/>
-        </w:rPr>
-        <w:t>America/Sao_Paulo</w:t>
-      </w:r>
-      <w:r>
-        <w:t xml:space="preserve">). O evento </w:t>
-      </w:r>
-      <w:r>
-        <w:rPr>
-          <w:rFonts w:ascii="Consolas" w:hAnsi="Consolas"/>
-          <w:color w:val="5B2C83"/>
-          <w:sz w:val="18"/>
-        </w:rPr>
-        <w:t>schedule</w:t>
-      </w:r>
-      <w:r>
-        <w:t xml:space="preserve"> executa a versão que está na branch padrão. Portanto, o novo horário passa a valer quando esta alteração chegar à </w:t>
-      </w:r>
-      <w:r>
-        <w:rPr>
-          <w:rFonts w:ascii="Consolas" w:hAnsi="Consolas"/>
-          <w:color w:val="5B2C83"/>
-          <w:sz w:val="18"/>
-        </w:rPr>
-        <w:t>main</w:t>
-      </w:r>
-      <w:r>
-        <w:t xml:space="preserve">. A análise diária publica resultados; não cria nem mescla commits. O GitHub pode atrasar uma execução agendada durante períodos de alta demanda. Não há gatilho </w:t>
-      </w:r>
-      <w:r>
-        <w:rPr>
-          <w:rFonts w:ascii="Consolas" w:hAnsi="Consolas"/>
-          <w:color w:val="5B2C83"/>
-          <w:sz w:val="18"/>
-        </w:rPr>
-        <w:t>workflow_dispatch</w:t>
-      </w:r>
-      <w:r>
-        <w:t xml:space="preserve">, então o botão </w:t>
-      </w:r>
-      <w:r>
-        <w:rPr>
-          <w:b/>
-        </w:rPr>
-        <w:t>Run workflow</w:t>
-      </w:r>
-      <w:r>
-        <w:t xml:space="preserve"> não está configurado.</w:t>
+        <w:t>No Default setup, o GitHub seleciona os eventos de análise e as linguagens na configuração de Code Scanning. Esse agendamento não é configurado pelo cron do YAML acima. Para alterar linguagens ou conjunto de consultas, use Settings &gt; Advanced Security &gt; Code scanning &gt; CodeQL analysis &gt; Edit (os rótulos podem variar). A análise publica resultados em Security &gt; Code scanning e checks de PR; não cria nem mescla commits.</w:t>
       </w:r>
     </w:p>
     <w:p>
       <w:r>
-        <w:t xml:space="preserve">Para administrar: revise o YAML em </w:t>
-      </w:r>
-      <w:r>
-        <w:rPr>
-          <w:rFonts w:ascii="Consolas" w:hAnsi="Consolas"/>
-          <w:color w:val="5B2C83"/>
-          <w:sz w:val="18"/>
-        </w:rPr>
-        <w:t>.github/workflows/codeql.yml</w:t>
-      </w:r>
-      <w:r>
-        <w:t xml:space="preserve">, acompanhe </w:t>
-      </w:r>
-      <w:r>
-        <w:rPr>
-          <w:b/>
-        </w:rPr>
-        <w:t>Actions &gt; CodeQL Advanced</w:t>
-      </w:r>
-      <w:r>
-        <w:t xml:space="preserve"> e depois </w:t>
-      </w:r>
-      <w:r>
-        <w:rPr>
-          <w:b/>
-        </w:rPr>
-        <w:t>Security &gt; Code scanning</w:t>
-      </w:r>
-      <w:r>
-        <w:t>. A matriz atual analisa GitHub Actions, Java e JavaScript/TypeScript; a aplicação está em Java. Em um PR de demonstração, o job CodeQL terminou, mas o resultado agregado Code Scanning apontou uma injeção SQL de severidade alta na linha do repositório indicada pelo alerta. Um check vermelho não bloqueia merge automaticamente; isso depende das regras de proteção da branch.</w:t>
+        <w:t>Para administrar: revise a configuração de CodeQL em Settings &gt; Advanced Security &gt; Code scanning; acompanhe as execuções gerenciadas em Actions e os alertas em Security &gt; Code scanning. O histórico do repositório mostra uma vulnerabilidade demonstrativa de SQL Injection High com arquivo e linha. Um check vermelho não bloqueia merge automaticamente; isso depende das regras de proteção da branch.</w:t>
       </w:r>
     </w:p>
     <w:p>
@@ -1312,62 +1149,7 @@
     </w:p>
     <w:p>
       <w:r>
-        <w:t xml:space="preserve">O job </w:t>
-      </w:r>
-      <w:r>
-        <w:rPr>
-          <w:rFonts w:ascii="Consolas" w:hAnsi="Consolas"/>
-          <w:color w:val="5B2C83"/>
-          <w:sz w:val="18"/>
-        </w:rPr>
-        <w:t>Export Code Scanning metrics</w:t>
-      </w:r>
-      <w:r>
-        <w:t xml:space="preserve">, em </w:t>
-      </w:r>
-      <w:r>
-        <w:rPr>
-          <w:rFonts w:ascii="Consolas" w:hAnsi="Consolas"/>
-          <w:color w:val="5B2C83"/>
-          <w:sz w:val="18"/>
-        </w:rPr>
-        <w:t>.github/workflows/codeql.yml</w:t>
-      </w:r>
-      <w:r>
-        <w:t xml:space="preserve">, consulta a REST API do GitHub com o </w:t>
-      </w:r>
-      <w:r>
-        <w:rPr>
-          <w:rFonts w:ascii="Consolas" w:hAnsi="Consolas"/>
-          <w:color w:val="5B2C83"/>
-          <w:sz w:val="18"/>
-        </w:rPr>
-        <w:t>GITHUB_TOKEN</w:t>
-      </w:r>
-      <w:r>
-        <w:t xml:space="preserve"> temporário da própria execução. A permissão fica limitada ao necessário: </w:t>
-      </w:r>
-      <w:r>
-        <w:rPr>
-          <w:rFonts w:ascii="Consolas" w:hAnsi="Consolas"/>
-          <w:color w:val="5B2C83"/>
-          <w:sz w:val="18"/>
-        </w:rPr>
-        <w:t>security-events: read</w:t>
-      </w:r>
-      <w:r>
-        <w:t xml:space="preserve"> para consultar alertas/análises e </w:t>
-      </w:r>
-      <w:r>
-        <w:rPr>
-          <w:rFonts w:ascii="Consolas" w:hAnsi="Consolas"/>
-          <w:color w:val="5B2C83"/>
-          <w:sz w:val="18"/>
-        </w:rPr>
-        <w:t>contents: read</w:t>
-      </w:r>
-      <w:r>
-        <w:t xml:space="preserve"> para baixar o script versionado. Não é necessário criar um Personal Access Token nem cadastrar um secret.</w:t>
+        <w:t>O workflow separado .github/workflows/code-scanning-metrics.yml consulta a REST API do GitHub com o GITHUB_TOKEN temporário. Ele não ativa, substitui nem executa o CodeQL. Em push/PR, aguarda até dez minutos por uma análise CodeQL que corresponda ao commit da execução. No evento de PR usa pull_request_target, executa a cópia confiável do workflow da branch base, faz checkout do commit base e não executa o código proposto pelo PR. A tarefa diária de métricas apenas registra o estado atual dos alertas e os metadados da análise mais recente; não provoca uma análise CodeQL diária. O workflow de PR passa a existir na branch base depois que a mantenedora aprovar e mesclar esta alteração. A permissão fica limitada a security-events: read para consultar alertas/análises e contents: read para ler o script. Não é necessário criar um Personal Access Token nem cadastrar um secret.</w:t>
       </w:r>
     </w:p>
     <w:p>
@@ -1380,25 +1162,7 @@
         <w:pStyle w:val="ListNumber"/>
       </w:pPr>
       <w:r>
-        <w:t xml:space="preserve">Abra </w:t>
-      </w:r>
-      <w:r>
-        <w:rPr>
-          <w:b/>
-        </w:rPr>
-        <w:t>Actions</w:t>
-      </w:r>
-      <w:r>
-        <w:t xml:space="preserve"> e escolha uma execução de </w:t>
-      </w:r>
-      <w:r>
-        <w:rPr>
-          <w:b/>
-        </w:rPr>
-        <w:t>CodeQL Advanced</w:t>
-      </w:r>
-      <w:r>
-        <w:t>.</w:t>
+        <w:t>Depois que o workflow for mesclado, abra Actions e escolha uma execução de Code Scanning metrics.</w:t>
       </w:r>
     </w:p>
     <w:p>
@@ -1491,7 +1255,7 @@
     </w:p>
     <w:p>
       <w:r>
-        <w:t>O relatório inclui timestamp UTC, branch ou número do PR, commit, link e resultado dos jobs CodeQL. Por categoria, a API informa a ferramenta/versão, horário, commit, resultados e regras executadas. Isso permite ver quais linguagens/configurações reportaram análise; a API não fornece a quantidade de arquivos-fonte examinados. Uma categoria só é evidência de análise concluída se seu commit/horário corresponderem à execução observada.</w:t>
+        <w:t>O relatório inclui timestamp UTC, branch ou número do PR, commit, link da execução e se a API encontrou uma análise CodeQL associada ao commit atual (analysis.matched_current_execution). Por categoria, a API informa a ferramenta/versão, horário, commit, resultados e regras executadas. Isso permite ver linguagens/categorias e regras reportadas; a API não fornece a quantidade de arquivos-fonte examinados. Se matched_current_execution for false, as categorias listadas são a análise mais recente disponível e não devem ser tratadas como resultado do commit atual. O relatório diário não garante que houve uma análise CodeQL naquele dia.</w:t>
       </w:r>
     </w:p>
     <w:p>
@@ -1545,78 +1309,12 @@
     </w:p>
     <w:p>
       <w:r>
-        <w:t xml:space="preserve">Os arquivos não incluem ator, comentário, local do alerta nem identificadores individuais. O artifact fica vinculado à execução e expira após 90 dias (limite máximo configurado para um repositório público). Para preservar histórico por mais tempo, será necessário aprovar outro destino de armazenamento. Se uma análise falhar, o job de métricas ainda tenta registrar o estado que a API disponibiliza; confira </w:t>
-      </w:r>
-      <w:r>
-        <w:rPr>
-          <w:rFonts w:ascii="Consolas" w:hAnsi="Consolas"/>
-          <w:color w:val="5B2C83"/>
-          <w:sz w:val="18"/>
-        </w:rPr>
-        <w:t>codeql_job_result</w:t>
-      </w:r>
-      <w:r>
-        <w:t xml:space="preserve"> e o commit/horário das categorias para não interpretar dados antigos como resultado da execução atual.</w:t>
+        <w:t>Os arquivos não incluem ator, comentário, local do alerta nem identificadores individuais. O artifact fica vinculado à execução e expira após 90 dias (limite máximo configurado para um repositório público). Para preservar histórico por mais tempo, será necessário aprovar outro destino de armazenamento. Se matched_current_execution for false, consulte o check CodeQL correspondente em Actions; o workflow de métricas não lê o resultado interno daquele job gerenciado.</w:t>
       </w:r>
     </w:p>
     <w:p>
       <w:r>
-        <w:t xml:space="preserve">O script </w:t>
-      </w:r>
-      <w:r>
-        <w:rPr>
-          <w:rFonts w:ascii="Consolas" w:hAnsi="Consolas"/>
-          <w:color w:val="5B2C83"/>
-          <w:sz w:val="18"/>
-        </w:rPr>
-        <w:t>scripts/export_code_scanning_metrics.py</w:t>
-      </w:r>
-      <w:r>
-        <w:t xml:space="preserve"> percorre as páginas da API, agrega os alertas sem dados pessoais, seleciona a análise mais recente por categoria e grava os arquivos mencionados. Para adaptar em outro repositório, copie o script, adicione um job após a análise, conceda somente </w:t>
-      </w:r>
-      <w:r>
-        <w:rPr>
-          <w:rFonts w:ascii="Consolas" w:hAnsi="Consolas"/>
-          <w:color w:val="5B2C83"/>
-          <w:sz w:val="18"/>
-        </w:rPr>
-        <w:t>security-events: read</w:t>
-      </w:r>
-      <w:r>
-        <w:t xml:space="preserve"> e </w:t>
-      </w:r>
-      <w:r>
-        <w:rPr>
-          <w:rFonts w:ascii="Consolas" w:hAnsi="Consolas"/>
-          <w:color w:val="5B2C83"/>
-          <w:sz w:val="18"/>
-        </w:rPr>
-        <w:t>contents: read</w:t>
-      </w:r>
-      <w:r>
-        <w:t xml:space="preserve">, forneça </w:t>
-      </w:r>
-      <w:r>
-        <w:rPr>
-          <w:rFonts w:ascii="Consolas" w:hAnsi="Consolas"/>
-          <w:color w:val="5B2C83"/>
-          <w:sz w:val="18"/>
-        </w:rPr>
-        <w:t>${{ github.token }}</w:t>
-      </w:r>
-      <w:r>
-        <w:t xml:space="preserve"> como variável de ambiente e publique a pasta criada com </w:t>
-      </w:r>
-      <w:r>
-        <w:rPr>
-          <w:rFonts w:ascii="Consolas" w:hAnsi="Consolas"/>
-          <w:color w:val="5B2C83"/>
-          <w:sz w:val="18"/>
-        </w:rPr>
-        <w:t>actions/upload-artifact</w:t>
-      </w:r>
-      <w:r>
-        <w:t>. Não coloque o token em linha de comando, arquivo do repositório ou log.</w:t>
+        <w:t>O script scripts/export_code_scanning_metrics.py percorre as páginas da API, agrega os alertas sem dados pessoais, aguarda a análise atual em execuções de push/PR e grava os arquivos mencionados. Para adaptar em outro repositório que usa Default setup, adicione um workflow separado, conceda somente security-events: read e contents: read, forneça ${{ github.token }} como variável de ambiente e publique a pasta criada com actions/upload-artifact. Não coloque o token em linha de comando, arquivo do repositório ou log. O endpoint de análises também requer que Code Scanning esteja disponível no repositório.</w:t>
       </w:r>
     </w:p>
     <w:p>
@@ -1881,7 +1579,7 @@
         <w:pStyle w:val="ListNumber"/>
       </w:pPr>
       <w:r>
-        <w:t>Acompanhar o workflow Maven e o CodeQL Advanced separadamente.</w:t>
+        <w:t>Acompanhar o workflow Maven e o CodeQL gerenciado separadamente.</w:t>
       </w:r>
     </w:p>
     <w:p>
@@ -1889,7 +1587,7 @@
         <w:pStyle w:val="ListNumber"/>
       </w:pPr>
       <w:r>
-        <w:t>Observar a análise agendada diária do CodeQL.</w:t>
+        <w:t>Observar CodeQL conforme os eventos definidos pelo Default setup e distinguir a execução diária do relatório de métricas.</w:t>
       </w:r>
     </w:p>
     <w:p>
@@ -2038,30 +1736,7 @@
         <w:pStyle w:val="ListBullet"/>
       </w:pPr>
       <w:r>
-        <w:t xml:space="preserve">CodeQL foi habilitado por Advanced setup em </w:t>
-      </w:r>
-      <w:r>
-        <w:rPr>
-          <w:rFonts w:ascii="Consolas" w:hAnsi="Consolas"/>
-          <w:color w:val="5B2C83"/>
-          <w:sz w:val="18"/>
-        </w:rPr>
-        <w:t>.github/workflows/codeql.yml</w:t>
-      </w:r>
-      <w:r>
-        <w:t xml:space="preserve">; a execução inicial está em </w:t>
-      </w:r>
-      <w:r>
-        <w:t>CodeQL Advanced #1 — https://github.com/aeroschmidt/scanner-loja-instrumentos/actions/runs/38104871050</w:t>
-      </w:r>
-      <w:r>
-        <w:t xml:space="preserve"> e a execução mais recente em </w:t>
-      </w:r>
-      <w:r>
-        <w:t>CodeQL Advanced #3 — https://github.com/aeroschmidt/scanner-loja-instrumentos/actions/runs/38105323924</w:t>
-      </w:r>
-      <w:r>
-        <w:t>.</w:t>
+        <w:t>Historicamente, o CodeQL foi configurado primeiro por Advanced setup; depois, o repositório passou ao Default setup gerenciado pelo GitHub. As execuções históricas estão em CodeQL Advanced #1 — https://github.com/aeroschmidt/scanner-loja-instrumentos/actions/runs/38104871050 e CodeQL Advanced #3 — https://github.com/aeroschmidt/scanner-loja-instrumentos/actions/runs/38105323924.</w:t>
       </w:r>
     </w:p>
     <w:p>
@@ -2083,18 +1758,7 @@
         <w:pStyle w:val="ListBullet"/>
       </w:pPr>
       <w:r>
-        <w:t xml:space="preserve">O cron neste documento foi ajustado para análise diária ao meio-dia de Brasília. A mudança precisa estar na branch padrão para que o evento </w:t>
-      </w:r>
-      <w:r>
-        <w:rPr>
-          <w:rFonts w:ascii="Consolas" w:hAnsi="Consolas"/>
-          <w:color w:val="5B2C83"/>
-          <w:sz w:val="18"/>
-        </w:rPr>
-        <w:t>schedule</w:t>
-      </w:r>
-      <w:r>
-        <w:t xml:space="preserve"> use o novo horário.</w:t>
+        <w:t>O repositório usa Default setup; o workflow YAML Advanced aparece desabilitado manualmente pelo GitHub. Seu cron diário não executa análises.</w:t>
       </w:r>
     </w:p>
     <w:p>
@@ -2102,7 +1766,7 @@
         <w:pStyle w:val="ListBullet"/>
       </w:pPr>
       <w:r>
-        <w:t>A exportação de métricas foi proposta em um PR separado após o merge do PR #11. Os artifacts passam a aparecer quando essa alteração for aprovada, mesclada e o workflow executar; cada artifact terá retenção de 90 dias.</w:t>
+        <w:t>A exportação de métricas está sendo preparada no PR #12 — https://github.com/aeroschmidt/scanner-loja-instrumentos/pull/12 — como workflow separado para manter o Default setup. Os artifacts só aparecem após aprovação, merge e execução; cada artifact terá retenção de até 90 dias.</w:t>
       </w:r>
     </w:p>
     <w:p>

</xml_diff>

<commit_message>
Use trusted manual snapshots for PR metrics
</commit_message>
<xml_diff>
--- a/docs/guia-github-actions-e-seguranca.docx
+++ b/docs/guia-github-actions-e-seguranca.docx
@@ -394,7 +394,7 @@
           </w:tcPr>
           <w:p>
             <w:r>
-              <w:t>.github/workflows/code-scanning-metrics.yml fará snapshots diários, em push para main e em PRs após o merge do workflow; consulta o Code Scanning gerenciado pela API REST.</w:t>
+              <w:t>.github/workflows/code-scanning-metrics.yml fará snapshots diários e em push para main; a mantenedora pode executá-lo manualmente em main, com número opcional de PR.</w:t>
             </w:r>
           </w:p>
         </w:tc>
@@ -1149,7 +1149,7 @@
     </w:p>
     <w:p>
       <w:r>
-        <w:t>O workflow separado .github/workflows/code-scanning-metrics.yml consulta a REST API do GitHub com o GITHUB_TOKEN temporário. Ele não ativa, substitui nem executa o CodeQL. Em push/PR, aguarda até dez minutos por uma análise CodeQL que corresponda ao commit da execução. No evento de PR usa pull_request_target, executa a cópia confiável do workflow da branch base, faz checkout do commit base e não executa o código proposto pelo PR. A tarefa diária de métricas apenas registra o estado atual dos alertas e os metadados da análise mais recente; não provoca uma análise CodeQL diária. O workflow de PR passa a existir na branch base depois que a mantenedora aprovar e mesclar esta alteração. A permissão fica limitada a security-events: read para consultar alertas/análises e contents: read para ler o script. Não é necessário criar um Personal Access Token nem cadastrar um secret.</w:t>
+        <w:t>O workflow separado .github/workflows/code-scanning-metrics.yml consulta a REST API do GitHub com o GITHUB_TOKEN temporário. Ele não ativa, substitui nem executa o CodeQL. Em push para main, aguarda até dez minutos por uma análise CodeQL que corresponda ao commit da execução. A tarefa diária de métricas apenas registra o estado atual dos alertas e os metadados da análise mais recente; não provoca uma análise CodeQL diária. Para obter um retrato de um PR antes do merge, a mantenedora pode iniciar Actions &gt; Code Scanning metrics &gt; Run workflow, escolher a branch padrão main e informar o número do PR no campo opcional. O script lê os resultados do PR pela API e espera pela análise correspondente; não faz checkout do código do PR. A execução manual em branches diferentes da padrão é bloqueada. As permissões ficam limitadas a security-events: read para consultar alertas/análises, pull-requests: read para buscar metadados do PR e contents: read para ler o script. Não é necessário criar um Personal Access Token nem cadastrar um secret.</w:t>
       </w:r>
     </w:p>
     <w:p>
@@ -1162,7 +1162,7 @@
         <w:pStyle w:val="ListNumber"/>
       </w:pPr>
       <w:r>
-        <w:t>Depois que o workflow for mesclado, abra Actions e escolha uma execução de Code Scanning metrics.</w:t>
+        <w:t>Depois que o workflow for mesclado, abra Actions e escolha uma execução de Code Scanning metrics. Para um PR específico, use Run workflow na branch main e informe o número do PR.</w:t>
       </w:r>
     </w:p>
     <w:p>
@@ -1314,7 +1314,7 @@
     </w:p>
     <w:p>
       <w:r>
-        <w:t>O script scripts/export_code_scanning_metrics.py percorre as páginas da API, agrega os alertas sem dados pessoais, aguarda a análise atual em execuções de push/PR e grava os arquivos mencionados. Para adaptar em outro repositório que usa Default setup, adicione um workflow separado, conceda somente security-events: read e contents: read, forneça ${{ github.token }} como variável de ambiente e publique a pasta criada com actions/upload-artifact. Não coloque o token em linha de comando, arquivo do repositório ou log. O endpoint de análises também requer que Code Scanning esteja disponível no repositório.</w:t>
+        <w:t>O script scripts/export_code_scanning_metrics.py percorre as páginas da API, agrega os alertas sem dados pessoais, aguarda a análise atual em pushes e em uma execução manual direcionada a PR, e grava os arquivos mencionados. Para adaptar em outro repositório que usa Default setup, adicione um workflow separado, conceda somente security-events: read e contents: read; inclua pull-requests: read se também consultar metadados de PR. Forneça ${ github.token } como variável de ambiente e publique a pasta criada com actions/upload-artifact. Não coloque o token em linha de comando, arquivo do repositório ou log. O endpoint de análises também requer que Code Scanning esteja disponível no repositório.</w:t>
       </w:r>
     </w:p>
     <w:p>

</xml_diff>

<commit_message>
Document CodeQL check visibility for maintainers
</commit_message>
<xml_diff>
--- a/docs/guia-github-actions-e-seguranca.docx
+++ b/docs/guia-github-actions-e-seguranca.docx
@@ -359,7 +359,18 @@
           </w:tcPr>
           <w:p>
             <w:r>
-              <w:t>O GitHub gerencia a análise. O workflow YAML Advanced existente aparece como disabled_manually; seu cron não agenda a análise CodeQL.</w:t>
+              <w:t xml:space="preserve">O GitHub gerencia a análise. O workflow YAML Advanced existente aparece como </w:t>
+            </w:r>
+            <w:r>
+              <w:rPr>
+                <w:rFonts w:ascii="Consolas" w:hAnsi="Consolas"/>
+                <w:color w:val="5B2C83"/>
+                <w:sz w:val="18"/>
+              </w:rPr>
+              <w:t>disabled_manually</w:t>
+            </w:r>
+            <w:r>
+              <w:t>; seu cron não agenda a análise CodeQL.</w:t>
             </w:r>
           </w:p>
         </w:tc>
@@ -394,7 +405,37 @@
           </w:tcPr>
           <w:p>
             <w:r>
-              <w:t>.github/workflows/code-scanning-metrics.yml fará snapshots diários e em push para main; a mantenedora pode executá-lo manualmente em main, com número opcional de PR.</w:t>
+              <w:rPr>
+                <w:rFonts w:ascii="Consolas" w:hAnsi="Consolas"/>
+                <w:color w:val="5B2C83"/>
+                <w:sz w:val="18"/>
+              </w:rPr>
+              <w:t>.github/workflows/code-scanning-metrics.yml</w:t>
+            </w:r>
+            <w:r>
+              <w:t xml:space="preserve"> fará snapshots diários e em push para </w:t>
+            </w:r>
+            <w:r>
+              <w:rPr>
+                <w:rFonts w:ascii="Consolas" w:hAnsi="Consolas"/>
+                <w:color w:val="5B2C83"/>
+                <w:sz w:val="18"/>
+              </w:rPr>
+              <w:t>main</w:t>
+            </w:r>
+            <w:r>
+              <w:t xml:space="preserve">; a mantenedora pode executá-lo manualmente em </w:t>
+            </w:r>
+            <w:r>
+              <w:rPr>
+                <w:rFonts w:ascii="Consolas" w:hAnsi="Consolas"/>
+                <w:color w:val="5B2C83"/>
+                <w:sz w:val="18"/>
+              </w:rPr>
+              <w:t>main</w:t>
+            </w:r>
+            <w:r>
+              <w:t>, com número opcional de PR.</w:t>
             </w:r>
           </w:p>
         </w:tc>
@@ -1078,7 +1119,58 @@
     </w:p>
     <w:p>
       <w:r>
-        <w:t>O repositório está usando Default setup, administrado nas configurações do GitHub. O GitHub cria e executa a configuração sem depender de um workflow versionado. O YAML .github/workflows/codeql.yml é um arquivo antigo de Advanced setup; a interface informa que ele está disabled_manually porque o Default setup está ativo. Por isso, o schedule que aparece nesse YAML não executa uma análise CodeQL. A imagem do material didático compara os dois modos; ela não é uma tela específica deste repositório.</w:t>
+        <w:t xml:space="preserve">O repositório está usando </w:t>
+      </w:r>
+      <w:r>
+        <w:rPr>
+          <w:b/>
+        </w:rPr>
+        <w:t>Default setup</w:t>
+      </w:r>
+      <w:r>
+        <w:t xml:space="preserve">, administrado nas configurações do GitHub. O GitHub cria e executa a configuração sem depender de um workflow versionado. O YAML </w:t>
+      </w:r>
+      <w:r>
+        <w:rPr>
+          <w:rFonts w:ascii="Consolas" w:hAnsi="Consolas"/>
+          <w:color w:val="5B2C83"/>
+          <w:sz w:val="18"/>
+        </w:rPr>
+        <w:t>.github/workflows/codeql.yml</w:t>
+      </w:r>
+      <w:r>
+        <w:t xml:space="preserve"> é um arquivo antigo de </w:t>
+      </w:r>
+      <w:r>
+        <w:rPr>
+          <w:b/>
+        </w:rPr>
+        <w:t>Advanced setup</w:t>
+      </w:r>
+      <w:r>
+        <w:t xml:space="preserve">; a interface informa que ele está </w:t>
+      </w:r>
+      <w:r>
+        <w:rPr>
+          <w:rFonts w:ascii="Consolas" w:hAnsi="Consolas"/>
+          <w:color w:val="5B2C83"/>
+          <w:sz w:val="18"/>
+        </w:rPr>
+        <w:t>disabled_manually</w:t>
+      </w:r>
+      <w:r>
+        <w:t xml:space="preserve"> porque o Default setup está ativo. Por isso, o </w:t>
+      </w:r>
+      <w:r>
+        <w:rPr>
+          <w:rFonts w:ascii="Consolas" w:hAnsi="Consolas"/>
+          <w:color w:val="5B2C83"/>
+          <w:sz w:val="18"/>
+        </w:rPr>
+        <w:t>schedule</w:t>
+      </w:r>
+      <w:r>
+        <w:t xml:space="preserve"> que aparece nesse YAML não executa uma análise CodeQL. A imagem do material didático compara os dois modos; ela não é uma tela específica deste repositório.</w:t>
       </w:r>
     </w:p>
     <w:p>
@@ -1131,12 +1223,134 @@
     </w:p>
     <w:p>
       <w:r>
-        <w:t>No Default setup, o GitHub seleciona os eventos de análise e as linguagens na configuração de Code Scanning. Esse agendamento não é configurado pelo cron do YAML acima. Para alterar linguagens ou conjunto de consultas, use Settings &gt; Advanced Security &gt; Code scanning &gt; CodeQL analysis &gt; Edit (os rótulos podem variar). A análise publica resultados em Security &gt; Code scanning e checks de PR; não cria nem mescla commits.</w:t>
+        <w:t xml:space="preserve">No Default setup, o GitHub seleciona os eventos de análise e as linguagens na configuração de Code Scanning. Esse agendamento não é configurado pelo cron do YAML acima. Para alterar linguagens ou conjunto de consultas, use </w:t>
+      </w:r>
+      <w:r>
+        <w:rPr>
+          <w:b/>
+        </w:rPr>
+        <w:t>Settings &gt; Advanced Security &gt; Code scanning &gt; CodeQL analysis &gt; Edit</w:t>
+      </w:r>
+      <w:r>
+        <w:t xml:space="preserve"> (os rótulos podem variar). A análise publica resultados em </w:t>
+      </w:r>
+      <w:r>
+        <w:rPr>
+          <w:b/>
+        </w:rPr>
+        <w:t>Security &gt; Code scanning</w:t>
+      </w:r>
+      <w:r>
+        <w:t xml:space="preserve"> e checks de PR; não cria nem mescla commits.</w:t>
       </w:r>
     </w:p>
     <w:p>
       <w:r>
-        <w:t>Para administrar: revise a configuração de CodeQL em Settings &gt; Advanced Security &gt; Code scanning; acompanhe as execuções gerenciadas em Actions e os alertas em Security &gt; Code scanning. O histórico do repositório mostra uma vulnerabilidade demonstrativa de SQL Injection High com arquivo e linha. Um check vermelho não bloqueia merge automaticamente; isso depende das regras de proteção da branch.</w:t>
+        <w:t xml:space="preserve">Para administrar: revise a configuração de CodeQL em </w:t>
+      </w:r>
+      <w:r>
+        <w:rPr>
+          <w:b/>
+        </w:rPr>
+        <w:t>Settings &gt; Advanced Security &gt; Code scanning</w:t>
+      </w:r>
+      <w:r>
+        <w:t xml:space="preserve">; acompanhe as execuções gerenciadas em </w:t>
+      </w:r>
+      <w:r>
+        <w:rPr>
+          <w:b/>
+        </w:rPr>
+        <w:t>Actions</w:t>
+      </w:r>
+      <w:r>
+        <w:t xml:space="preserve"> e os alertas em </w:t>
+      </w:r>
+      <w:r>
+        <w:rPr>
+          <w:b/>
+        </w:rPr>
+        <w:t>Security &gt; Code scanning</w:t>
+      </w:r>
+      <w:r>
+        <w:t>. O histórico do repositório mostra uma vulnerabilidade demonstrativa de SQL Injection High com arquivo e linha. Um check vermelho não bloqueia merge automaticamente; isso depende das regras de proteção da branch.</w:t>
+      </w:r>
+    </w:p>
+    <w:p>
+      <w:r>
+        <w:t>#### Por que o CodeQL pode não aparecer como comentário na Conversation</w:t>
+      </w:r>
+    </w:p>
+    <w:p>
+      <w:r>
+        <w:t xml:space="preserve">A aba </w:t>
+      </w:r>
+      <w:r>
+        <w:rPr>
+          <w:b/>
+        </w:rPr>
+        <w:t>Checks</w:t>
+      </w:r>
+      <w:r>
+        <w:t xml:space="preserve"> e a linha do tempo </w:t>
+      </w:r>
+      <w:r>
+        <w:rPr>
+          <w:b/>
+        </w:rPr>
+        <w:t>Conversation</w:t>
+      </w:r>
+      <w:r>
+        <w:t xml:space="preserve"> mostram coisas diferentes. Uma execução CodeQL pode terminar e aparecer em </w:t>
+      </w:r>
+      <w:r>
+        <w:rPr>
+          <w:b/>
+        </w:rPr>
+        <w:t>Checks</w:t>
+      </w:r>
+      <w:r>
+        <w:t xml:space="preserve"> sem publicar um comentário na Conversation. Quando não há alertas novos no código alterado pelo PR, o resumo do check pode dizer *“No new alerts in code changed by this pull request”* e não ter anotações. Isso significa que aquela análise não encontrou alertas novos nas mudanças do PR; não significa que o CodeQL esteja desligado nem que o repositório inteiro esteja sem alertas.</w:t>
+      </w:r>
+    </w:p>
+    <w:p>
+      <w:r>
+        <w:t xml:space="preserve">Para confirmar uma execução, abra </w:t>
+      </w:r>
+      <w:r>
+        <w:rPr>
+          <w:b/>
+        </w:rPr>
+        <w:t>Checks &gt; CodeQL</w:t>
+      </w:r>
+      <w:r>
+        <w:t xml:space="preserve"> no PR e leia o resumo. Para consultar alertas existentes na branch, use </w:t>
+      </w:r>
+      <w:r>
+        <w:rPr>
+          <w:b/>
+        </w:rPr>
+        <w:t>Security &gt; Code scanning</w:t>
+      </w:r>
+      <w:r>
+        <w:t>. Se houver alertas relacionados às alterações do PR, abra a anotação e confira arquivo, linha e regra. A ausência de comentário na Conversation, isoladamente, não confirma falha da análise.</w:t>
+      </w:r>
+    </w:p>
+    <w:p>
+      <w:r>
+        <w:t xml:space="preserve">No PR </w:t>
+      </w:r>
+      <w:r>
+        <w:t>Restore visual Code Scanning guide for PR contributors — https://github.com/aeroschmidt/scanner-instrument-store/pull/16/checks?check_run_id=114984058749</w:t>
+      </w:r>
+      <w:r>
+        <w:t xml:space="preserve">, o CodeQL terminou com sucesso e registrou *“No new alerts in code changed by this pull request”*. Esse PR altera documentação e imagens, não código-fonte da aplicação; por isso não houve alerta novo nem anotação de código nesse check. O resultado pode ser consultado na execução </w:t>
+      </w:r>
+      <w:r>
+        <w:t>CodeQL do PR — https://github.com/aeroschmidt/scanner-instrument-store/runs/114984058749</w:t>
+      </w:r>
+      <w:r>
+        <w:t>.</w:t>
       </w:r>
     </w:p>
     <w:p>
@@ -1149,7 +1363,93 @@
     </w:p>
     <w:p>
       <w:r>
-        <w:t>O workflow separado .github/workflows/code-scanning-metrics.yml consulta a REST API do GitHub com o GITHUB_TOKEN temporário. Ele não ativa, substitui nem executa o CodeQL. Em push para main, aguarda até dez minutos por uma análise CodeQL que corresponda ao commit da execução. A tarefa diária de métricas apenas registra o estado atual dos alertas e os metadados da análise mais recente; não provoca uma análise CodeQL diária. Para obter um retrato de um PR antes do merge, a mantenedora pode iniciar Actions &gt; Code Scanning metrics &gt; Run workflow, escolher a branch padrão main e informar o número do PR no campo opcional. O script lê os resultados do PR pela API e espera pela análise correspondente; não faz checkout do código do PR. A execução manual em branches diferentes da padrão é bloqueada. As permissões ficam limitadas a security-events: read para consultar alertas/análises, pull-requests: read para buscar metadados do PR e contents: read para ler o script. Não é necessário criar um Personal Access Token nem cadastrar um secret.</w:t>
+        <w:t xml:space="preserve">O workflow separado </w:t>
+      </w:r>
+      <w:r>
+        <w:rPr>
+          <w:rFonts w:ascii="Consolas" w:hAnsi="Consolas"/>
+          <w:color w:val="5B2C83"/>
+          <w:sz w:val="18"/>
+        </w:rPr>
+        <w:t>.github/workflows/code-scanning-metrics.yml</w:t>
+      </w:r>
+      <w:r>
+        <w:t xml:space="preserve"> consulta a REST API do GitHub com o </w:t>
+      </w:r>
+      <w:r>
+        <w:rPr>
+          <w:rFonts w:ascii="Consolas" w:hAnsi="Consolas"/>
+          <w:color w:val="5B2C83"/>
+          <w:sz w:val="18"/>
+        </w:rPr>
+        <w:t>GITHUB_TOKEN</w:t>
+      </w:r>
+      <w:r>
+        <w:t xml:space="preserve"> temporário. Ele não ativa, substitui nem executa o CodeQL. Em push para </w:t>
+      </w:r>
+      <w:r>
+        <w:rPr>
+          <w:rFonts w:ascii="Consolas" w:hAnsi="Consolas"/>
+          <w:color w:val="5B2C83"/>
+          <w:sz w:val="18"/>
+        </w:rPr>
+        <w:t>main</w:t>
+      </w:r>
+      <w:r>
+        <w:t xml:space="preserve">, aguarda até dez minutos por uma análise CodeQL que corresponda ao commit da execução. A tarefa diária de métricas apenas registra o estado atual dos alertas e os metadados da análise mais recente; não provoca uma análise CodeQL diária. Para obter um retrato de um PR antes do merge, a mantenedora pode iniciar </w:t>
+      </w:r>
+      <w:r>
+        <w:rPr>
+          <w:b/>
+        </w:rPr>
+        <w:t>Actions &gt; Code Scanning metrics &gt; Run workflow</w:t>
+      </w:r>
+      <w:r>
+        <w:t xml:space="preserve">, escolher a branch padrão </w:t>
+      </w:r>
+      <w:r>
+        <w:rPr>
+          <w:rFonts w:ascii="Consolas" w:hAnsi="Consolas"/>
+          <w:color w:val="5B2C83"/>
+          <w:sz w:val="18"/>
+        </w:rPr>
+        <w:t>main</w:t>
+      </w:r>
+      <w:r>
+        <w:t xml:space="preserve"> e informar o número do PR no campo opcional. O script lê os resultados do PR pela API e espera pela análise correspondente; não faz checkout do código do PR. A execução manual em branches diferentes da padrão é bloqueada. As permissões ficam limitadas a </w:t>
+      </w:r>
+      <w:r>
+        <w:rPr>
+          <w:rFonts w:ascii="Consolas" w:hAnsi="Consolas"/>
+          <w:color w:val="5B2C83"/>
+          <w:sz w:val="18"/>
+        </w:rPr>
+        <w:t>security-events: read</w:t>
+      </w:r>
+      <w:r>
+        <w:t xml:space="preserve"> para consultar alertas/análises, </w:t>
+      </w:r>
+      <w:r>
+        <w:rPr>
+          <w:rFonts w:ascii="Consolas" w:hAnsi="Consolas"/>
+          <w:color w:val="5B2C83"/>
+          <w:sz w:val="18"/>
+        </w:rPr>
+        <w:t>pull-requests: read</w:t>
+      </w:r>
+      <w:r>
+        <w:t xml:space="preserve"> para buscar metadados do PR e </w:t>
+      </w:r>
+      <w:r>
+        <w:rPr>
+          <w:rFonts w:ascii="Consolas" w:hAnsi="Consolas"/>
+          <w:color w:val="5B2C83"/>
+          <w:sz w:val="18"/>
+        </w:rPr>
+        <w:t>contents: read</w:t>
+      </w:r>
+      <w:r>
+        <w:t xml:space="preserve"> para ler o script. Não é necessário criar um Personal Access Token nem cadastrar um secret.</w:t>
       </w:r>
     </w:p>
     <w:p>
@@ -1162,7 +1462,45 @@
         <w:pStyle w:val="ListNumber"/>
       </w:pPr>
       <w:r>
-        <w:t>Depois que o workflow for mesclado, abra Actions e escolha uma execução de Code Scanning metrics. Para um PR específico, use Run workflow na branch main e informe o número do PR.</w:t>
+        <w:t xml:space="preserve">Depois que o workflow for mesclado, abra </w:t>
+      </w:r>
+      <w:r>
+        <w:rPr>
+          <w:b/>
+        </w:rPr>
+        <w:t>Actions</w:t>
+      </w:r>
+      <w:r>
+        <w:t xml:space="preserve"> e escolha uma execução de </w:t>
+      </w:r>
+      <w:r>
+        <w:rPr>
+          <w:b/>
+        </w:rPr>
+        <w:t>Code Scanning metrics</w:t>
+      </w:r>
+      <w:r>
+        <w:t xml:space="preserve">. Para um PR específico, use </w:t>
+      </w:r>
+      <w:r>
+        <w:rPr>
+          <w:b/>
+        </w:rPr>
+        <w:t>Run workflow</w:t>
+      </w:r>
+      <w:r>
+        <w:t xml:space="preserve"> na branch </w:t>
+      </w:r>
+      <w:r>
+        <w:rPr>
+          <w:rFonts w:ascii="Consolas" w:hAnsi="Consolas"/>
+          <w:color w:val="5B2C83"/>
+          <w:sz w:val="18"/>
+        </w:rPr>
+        <w:t>main</w:t>
+      </w:r>
+      <w:r>
+        <w:t xml:space="preserve"> e informe o número do PR.</w:t>
       </w:r>
     </w:p>
     <w:p>
@@ -1255,7 +1593,40 @@
     </w:p>
     <w:p>
       <w:r>
-        <w:t>O relatório inclui timestamp UTC, branch ou número do PR, commit, link da execução e se a API encontrou uma análise CodeQL associada ao commit atual (analysis.matched_current_execution). Por categoria, a API informa a ferramenta/versão, horário, commit, resultados, regras executadas e uma coluna que sinaliza se aquela categoria corresponde ao commit da execução. Isso permite ver linguagens/categorias e regras reportadas; a API não fornece a quantidade de arquivos-fonte examinados. Se matched_current_execution for false, as categorias listadas são a análise mais recente disponível e não devem ser tratadas como resultado do commit atual. O relatório diário não garante que houve uma análise CodeQL naquele dia.</w:t>
+        <w:t>O relatório inclui timestamp UTC, branch ou número do PR, commit, link da execução e se a API encontrou uma análise CodeQL associada ao commit atual (</w:t>
+      </w:r>
+      <w:r>
+        <w:rPr>
+          <w:rFonts w:ascii="Consolas" w:hAnsi="Consolas"/>
+          <w:color w:val="5B2C83"/>
+          <w:sz w:val="18"/>
+        </w:rPr>
+        <w:t>analysis.matched_current_execution</w:t>
+      </w:r>
+      <w:r>
+        <w:t xml:space="preserve">). Por categoria, a API informa a ferramenta/versão, horário, commit, resultados, regras executadas e uma coluna que sinaliza se aquela categoria corresponde ao commit da execução. Isso permite ver linguagens/categorias e regras reportadas; a API não fornece a quantidade de arquivos-fonte examinados. Se </w:t>
+      </w:r>
+      <w:r>
+        <w:rPr>
+          <w:rFonts w:ascii="Consolas" w:hAnsi="Consolas"/>
+          <w:color w:val="5B2C83"/>
+          <w:sz w:val="18"/>
+        </w:rPr>
+        <w:t>matched_current_execution</w:t>
+      </w:r>
+      <w:r>
+        <w:t xml:space="preserve"> for </w:t>
+      </w:r>
+      <w:r>
+        <w:rPr>
+          <w:rFonts w:ascii="Consolas" w:hAnsi="Consolas"/>
+          <w:color w:val="5B2C83"/>
+          <w:sz w:val="18"/>
+        </w:rPr>
+        <w:t>false</w:t>
+      </w:r>
+      <w:r>
+        <w:t>, as categorias listadas são a análise mais recente disponível e não devem ser tratadas como resultado do commit atual. O relatório diário não garante que houve uma análise CodeQL naquele dia.</w:t>
       </w:r>
     </w:p>
     <w:p>
@@ -1309,12 +1680,109 @@
     </w:p>
     <w:p>
       <w:r>
-        <w:t>Os arquivos não incluem ator, comentário, local do alerta nem identificadores individuais. O artifact fica vinculado à execução e expira após 90 dias (limite máximo configurado para um repositório público). Para preservar histórico por mais tempo, será necessário aprovar outro destino de armazenamento. Se matched_current_execution for false, consulte o check CodeQL correspondente em Actions; o workflow de métricas não lê o resultado interno daquele job gerenciado.</w:t>
+        <w:t xml:space="preserve">Os arquivos não incluem ator, comentário, local do alerta nem identificadores individuais. O artifact fica vinculado à execução e expira após 90 dias (limite máximo configurado para um repositório público). Para preservar histórico por mais tempo, será necessário aprovar outro destino de armazenamento. Se </w:t>
+      </w:r>
+      <w:r>
+        <w:rPr>
+          <w:rFonts w:ascii="Consolas" w:hAnsi="Consolas"/>
+          <w:color w:val="5B2C83"/>
+          <w:sz w:val="18"/>
+        </w:rPr>
+        <w:t>matched_current_execution</w:t>
+      </w:r>
+      <w:r>
+        <w:t xml:space="preserve"> for </w:t>
+      </w:r>
+      <w:r>
+        <w:rPr>
+          <w:rFonts w:ascii="Consolas" w:hAnsi="Consolas"/>
+          <w:color w:val="5B2C83"/>
+          <w:sz w:val="18"/>
+        </w:rPr>
+        <w:t>false</w:t>
+      </w:r>
+      <w:r>
+        <w:t xml:space="preserve">, consulte o check CodeQL correspondente em </w:t>
+      </w:r>
+      <w:r>
+        <w:rPr>
+          <w:b/>
+        </w:rPr>
+        <w:t>Actions</w:t>
+      </w:r>
+      <w:r>
+        <w:t>; o workflow de métricas não lê o resultado interno daquele job gerenciado.</w:t>
       </w:r>
     </w:p>
     <w:p>
       <w:r>
-        <w:t>O script scripts/export_code_scanning_metrics.py percorre as páginas da API, agrega os alertas sem dados pessoais, aguarda a análise atual em pushes e em uma execução manual direcionada a PR, e grava os arquivos mencionados. Para adaptar em outro repositório que usa Default setup, adicione um workflow separado, conceda somente security-events: read e contents: read; inclua pull-requests: read se também consultar metadados de PR. Forneça ${ github.token } como variável de ambiente e publique a pasta criada com actions/upload-artifact. Não coloque o token em linha de comando, arquivo do repositório ou log. O endpoint de análises também requer que Code Scanning esteja disponível no repositório.</w:t>
+        <w:t xml:space="preserve">O script </w:t>
+      </w:r>
+      <w:r>
+        <w:rPr>
+          <w:rFonts w:ascii="Consolas" w:hAnsi="Consolas"/>
+          <w:color w:val="5B2C83"/>
+          <w:sz w:val="18"/>
+        </w:rPr>
+        <w:t>scripts/export_code_scanning_metrics.py</w:t>
+      </w:r>
+      <w:r>
+        <w:t xml:space="preserve"> percorre as páginas da API, agrega os alertas sem dados pessoais, aguarda a análise atual em pushes e em uma execução manual direcionada a PR, e grava os arquivos mencionados. Para adaptar em outro repositório que usa Default setup, adicione um workflow separado, conceda somente </w:t>
+      </w:r>
+      <w:r>
+        <w:rPr>
+          <w:rFonts w:ascii="Consolas" w:hAnsi="Consolas"/>
+          <w:color w:val="5B2C83"/>
+          <w:sz w:val="18"/>
+        </w:rPr>
+        <w:t>security-events: read</w:t>
+      </w:r>
+      <w:r>
+        <w:t xml:space="preserve"> e </w:t>
+      </w:r>
+      <w:r>
+        <w:rPr>
+          <w:rFonts w:ascii="Consolas" w:hAnsi="Consolas"/>
+          <w:color w:val="5B2C83"/>
+          <w:sz w:val="18"/>
+        </w:rPr>
+        <w:t>contents: read</w:t>
+      </w:r>
+      <w:r>
+        <w:t xml:space="preserve">; inclua </w:t>
+      </w:r>
+      <w:r>
+        <w:rPr>
+          <w:rFonts w:ascii="Consolas" w:hAnsi="Consolas"/>
+          <w:color w:val="5B2C83"/>
+          <w:sz w:val="18"/>
+        </w:rPr>
+        <w:t>pull-requests: read</w:t>
+      </w:r>
+      <w:r>
+        <w:t xml:space="preserve"> se também consultar metadados de PR. Forneça </w:t>
+      </w:r>
+      <w:r>
+        <w:rPr>
+          <w:rFonts w:ascii="Consolas" w:hAnsi="Consolas"/>
+          <w:color w:val="5B2C83"/>
+          <w:sz w:val="18"/>
+        </w:rPr>
+        <w:t>${{ github.token }}</w:t>
+      </w:r>
+      <w:r>
+        <w:t xml:space="preserve"> como variável de ambiente e publique a pasta criada com </w:t>
+      </w:r>
+      <w:r>
+        <w:rPr>
+          <w:rFonts w:ascii="Consolas" w:hAnsi="Consolas"/>
+          <w:color w:val="5B2C83"/>
+          <w:sz w:val="18"/>
+        </w:rPr>
+        <w:t>actions/upload-artifact</w:t>
+      </w:r>
+      <w:r>
+        <w:t>. Não coloque o token em linha de comando, arquivo do repositório ou log. O endpoint de análises também requer que Code Scanning esteja disponível no repositório.</w:t>
       </w:r>
     </w:p>
     <w:p>
@@ -1704,7 +2172,7 @@
         <w:pStyle w:val="ListBullet"/>
       </w:pPr>
       <w:r>
-        <w:t>Permissões para o token do workflow — https://docs.github.com/en/actions/security-for-github-actions/security-guides/automatic-token-authentication</w:t>
+        <w:t>Agenda de workflows do GitHub Actions — https://docs.github.com/en/actions/reference/workflows-and-actions/workflow-syntax#onschedule</w:t>
       </w:r>
     </w:p>
     <w:p>
@@ -1712,7 +2180,7 @@
         <w:pStyle w:val="ListBullet"/>
       </w:pPr>
       <w:r>
-        <w:t>Retenção de artifacts do Actions — https://docs.github.com/en/actions/how-tos/manage-workflow-runs/remove-workflow-artifacts</w:t>
+        <w:t>Permissões para o token do workflow — https://docs.github.com/en/actions/security-for-github-actions/security-guides/automatic-token-authentication</w:t>
       </w:r>
     </w:p>
     <w:p>
@@ -1720,6 +2188,14 @@
         <w:pStyle w:val="ListBullet"/>
       </w:pPr>
       <w:r>
+        <w:t>Retenção de artifacts do Actions — https://docs.github.com/en/actions/how-tos/manage-workflow-runs/remove-workflow-artifacts</w:t>
+      </w:r>
+    </w:p>
+    <w:p>
+      <w:pPr>
+        <w:pStyle w:val="ListBullet"/>
+      </w:pPr>
+      <w:r>
         <w:t>Quickstart de segurança do GitHub — https://docs.github.com/en/code-security/getting-started/quickstart-for-securing-your-repository</w:t>
       </w:r>
     </w:p>
@@ -1736,7 +2212,19 @@
         <w:pStyle w:val="ListBullet"/>
       </w:pPr>
       <w:r>
-        <w:t>Historicamente, o CodeQL foi configurado primeiro por Advanced setup; depois, o repositório passou ao Default setup gerenciado pelo GitHub. As execuções históricas estão em CodeQL Advanced #1 — https://github.com/aeroschmidt/scanner-loja-instrumentos/actions/runs/38104871050 e CodeQL Advanced #3 — https://github.com/aeroschmidt/scanner-loja-instrumentos/actions/runs/38105323924.</w:t>
+        <w:t xml:space="preserve">Historicamente, o CodeQL foi configurado primeiro por Advanced setup; depois, o repositório passou ao Default setup gerenciado pelo GitHub. As execuções históricas estão em </w:t>
+      </w:r>
+      <w:r>
+        <w:t>CodeQL Advanced #1 — https://github.com/aeroschmidt/scanner-loja-instrumentos/actions/runs/38104871050</w:t>
+      </w:r>
+      <w:r>
+        <w:t xml:space="preserve"> e </w:t>
+      </w:r>
+      <w:r>
+        <w:t>CodeQL Advanced #3 — https://github.com/aeroschmidt/scanner-loja-instrumentos/actions/runs/38105323924</w:t>
+      </w:r>
+      <w:r>
+        <w:t>.</w:t>
       </w:r>
     </w:p>
     <w:p>
@@ -1766,7 +2254,13 @@
         <w:pStyle w:val="ListBullet"/>
       </w:pPr>
       <w:r>
-        <w:t>A exportação de métricas está sendo preparada no PR #12 — https://github.com/aeroschmidt/scanner-loja-instrumentos/pull/12 — como workflow separado para manter o Default setup. Os artifacts só aparecem após aprovação, merge e execução; cada artifact terá retenção de até 90 dias.</w:t>
+        <w:t xml:space="preserve">A exportação de métricas está sendo preparada no </w:t>
+      </w:r>
+      <w:r>
+        <w:t>PR #12 — https://github.com/aeroschmidt/scanner-loja-instrumentos/pull/12</w:t>
+      </w:r>
+      <w:r>
+        <w:t xml:space="preserve"> como workflow separado para manter o Default setup. Os artifacts só aparecem após aprovação, merge e execução; cada artifact terá retenção de até 90 dias.</w:t>
       </w:r>
     </w:p>
     <w:p>

</xml_diff>

<commit_message>
Document when CodeQL does not comment on PR timeline
</commit_message>
<xml_diff>
--- a/docs/guia-github-actions-e-seguranca.docx
+++ b/docs/guia-github-actions-e-seguranca.docx
@@ -359,7 +359,18 @@
           </w:tcPr>
           <w:p>
             <w:r>
-              <w:t>O GitHub gerencia a análise. O workflow YAML Advanced existente aparece como disabled_manually; seu cron não agenda a análise CodeQL.</w:t>
+              <w:t xml:space="preserve">O GitHub gerencia a análise. O workflow YAML Advanced existente aparece como </w:t>
+            </w:r>
+            <w:r>
+              <w:rPr>
+                <w:rFonts w:ascii="Consolas" w:hAnsi="Consolas"/>
+                <w:color w:val="5B2C83"/>
+                <w:sz w:val="18"/>
+              </w:rPr>
+              <w:t>disabled_manually</w:t>
+            </w:r>
+            <w:r>
+              <w:t>; seu cron não agenda a análise CodeQL.</w:t>
             </w:r>
           </w:p>
         </w:tc>
@@ -394,7 +405,37 @@
           </w:tcPr>
           <w:p>
             <w:r>
-              <w:t>.github/workflows/code-scanning-metrics.yml fará snapshots diários e em push para main; a mantenedora pode executá-lo manualmente em main, com número opcional de PR.</w:t>
+              <w:rPr>
+                <w:rFonts w:ascii="Consolas" w:hAnsi="Consolas"/>
+                <w:color w:val="5B2C83"/>
+                <w:sz w:val="18"/>
+              </w:rPr>
+              <w:t>.github/workflows/code-scanning-metrics.yml</w:t>
+            </w:r>
+            <w:r>
+              <w:t xml:space="preserve"> fará snapshots diários e em push para </w:t>
+            </w:r>
+            <w:r>
+              <w:rPr>
+                <w:rFonts w:ascii="Consolas" w:hAnsi="Consolas"/>
+                <w:color w:val="5B2C83"/>
+                <w:sz w:val="18"/>
+              </w:rPr>
+              <w:t>main</w:t>
+            </w:r>
+            <w:r>
+              <w:t xml:space="preserve">; a mantenedora pode executá-lo manualmente em </w:t>
+            </w:r>
+            <w:r>
+              <w:rPr>
+                <w:rFonts w:ascii="Consolas" w:hAnsi="Consolas"/>
+                <w:color w:val="5B2C83"/>
+                <w:sz w:val="18"/>
+              </w:rPr>
+              <w:t>main</w:t>
+            </w:r>
+            <w:r>
+              <w:t>, com número opcional de PR.</w:t>
             </w:r>
           </w:p>
         </w:tc>
@@ -1078,7 +1119,58 @@
     </w:p>
     <w:p>
       <w:r>
-        <w:t>O repositório está usando Default setup, administrado nas configurações do GitHub. O GitHub cria e executa a configuração sem depender de um workflow versionado. O YAML .github/workflows/codeql.yml é um arquivo antigo de Advanced setup; a interface informa que ele está disabled_manually porque o Default setup está ativo. Por isso, o schedule que aparece nesse YAML não executa uma análise CodeQL. A imagem do material didático compara os dois modos; ela não é uma tela específica deste repositório.</w:t>
+        <w:t xml:space="preserve">O repositório está usando </w:t>
+      </w:r>
+      <w:r>
+        <w:rPr>
+          <w:b/>
+        </w:rPr>
+        <w:t>Default setup</w:t>
+      </w:r>
+      <w:r>
+        <w:t xml:space="preserve">, administrado nas configurações do GitHub. O GitHub cria e executa a configuração sem depender de um workflow versionado. O YAML </w:t>
+      </w:r>
+      <w:r>
+        <w:rPr>
+          <w:rFonts w:ascii="Consolas" w:hAnsi="Consolas"/>
+          <w:color w:val="5B2C83"/>
+          <w:sz w:val="18"/>
+        </w:rPr>
+        <w:t>.github/workflows/codeql.yml</w:t>
+      </w:r>
+      <w:r>
+        <w:t xml:space="preserve"> é um arquivo antigo de </w:t>
+      </w:r>
+      <w:r>
+        <w:rPr>
+          <w:b/>
+        </w:rPr>
+        <w:t>Advanced setup</w:t>
+      </w:r>
+      <w:r>
+        <w:t xml:space="preserve">; a interface informa que ele está </w:t>
+      </w:r>
+      <w:r>
+        <w:rPr>
+          <w:rFonts w:ascii="Consolas" w:hAnsi="Consolas"/>
+          <w:color w:val="5B2C83"/>
+          <w:sz w:val="18"/>
+        </w:rPr>
+        <w:t>disabled_manually</w:t>
+      </w:r>
+      <w:r>
+        <w:t xml:space="preserve"> porque o Default setup está ativo. Por isso, o </w:t>
+      </w:r>
+      <w:r>
+        <w:rPr>
+          <w:rFonts w:ascii="Consolas" w:hAnsi="Consolas"/>
+          <w:color w:val="5B2C83"/>
+          <w:sz w:val="18"/>
+        </w:rPr>
+        <w:t>schedule</w:t>
+      </w:r>
+      <w:r>
+        <w:t xml:space="preserve"> que aparece nesse YAML não executa uma análise CodeQL. A imagem do material didático compara os dois modos; ela não é uma tela específica deste repositório.</w:t>
       </w:r>
     </w:p>
     <w:p>
@@ -1131,12 +1223,134 @@
     </w:p>
     <w:p>
       <w:r>
-        <w:t>No Default setup, o GitHub seleciona os eventos de análise e as linguagens na configuração de Code Scanning. Esse agendamento não é configurado pelo cron do YAML acima. Para alterar linguagens ou conjunto de consultas, use Settings &gt; Advanced Security &gt; Code scanning &gt; CodeQL analysis &gt; Edit (os rótulos podem variar). A análise publica resultados em Security &gt; Code scanning e checks de PR; não cria nem mescla commits.</w:t>
+        <w:t xml:space="preserve">No Default setup, o GitHub seleciona os eventos de análise e as linguagens na configuração de Code Scanning. Esse agendamento não é configurado pelo cron do YAML acima. Para alterar linguagens ou conjunto de consultas, use </w:t>
+      </w:r>
+      <w:r>
+        <w:rPr>
+          <w:b/>
+        </w:rPr>
+        <w:t>Settings &gt; Advanced Security &gt; Code scanning &gt; CodeQL analysis &gt; Edit</w:t>
+      </w:r>
+      <w:r>
+        <w:t xml:space="preserve"> (os rótulos podem variar). A análise publica resultados em </w:t>
+      </w:r>
+      <w:r>
+        <w:rPr>
+          <w:b/>
+        </w:rPr>
+        <w:t>Security &gt; Code scanning</w:t>
+      </w:r>
+      <w:r>
+        <w:t xml:space="preserve"> e checks de PR; não cria nem mescla commits.</w:t>
       </w:r>
     </w:p>
     <w:p>
       <w:r>
-        <w:t>Para administrar: revise a configuração de CodeQL em Settings &gt; Advanced Security &gt; Code scanning; acompanhe as execuções gerenciadas em Actions e os alertas em Security &gt; Code scanning. O histórico do repositório mostra uma vulnerabilidade demonstrativa de SQL Injection High com arquivo e linha. Um check vermelho não bloqueia merge automaticamente; isso depende das regras de proteção da branch.</w:t>
+        <w:t xml:space="preserve">Para administrar: revise a configuração de CodeQL em </w:t>
+      </w:r>
+      <w:r>
+        <w:rPr>
+          <w:b/>
+        </w:rPr>
+        <w:t>Settings &gt; Advanced Security &gt; Code scanning</w:t>
+      </w:r>
+      <w:r>
+        <w:t xml:space="preserve">; acompanhe as execuções gerenciadas em </w:t>
+      </w:r>
+      <w:r>
+        <w:rPr>
+          <w:b/>
+        </w:rPr>
+        <w:t>Actions</w:t>
+      </w:r>
+      <w:r>
+        <w:t xml:space="preserve"> e os alertas em </w:t>
+      </w:r>
+      <w:r>
+        <w:rPr>
+          <w:b/>
+        </w:rPr>
+        <w:t>Security &gt; Code scanning</w:t>
+      </w:r>
+      <w:r>
+        <w:t>. O histórico do repositório mostra uma vulnerabilidade demonstrativa de SQL Injection High com arquivo e linha. Um check vermelho não bloqueia merge automaticamente; isso depende das regras de proteção da branch.</w:t>
+      </w:r>
+    </w:p>
+    <w:p>
+      <w:r>
+        <w:t>#### Por que o CodeQL pode não aparecer como comentário na Conversation</w:t>
+      </w:r>
+    </w:p>
+    <w:p>
+      <w:r>
+        <w:t xml:space="preserve">A aba </w:t>
+      </w:r>
+      <w:r>
+        <w:rPr>
+          <w:b/>
+        </w:rPr>
+        <w:t>Checks</w:t>
+      </w:r>
+      <w:r>
+        <w:t xml:space="preserve"> e a linha do tempo </w:t>
+      </w:r>
+      <w:r>
+        <w:rPr>
+          <w:b/>
+        </w:rPr>
+        <w:t>Conversation</w:t>
+      </w:r>
+      <w:r>
+        <w:t xml:space="preserve"> mostram coisas diferentes. Uma execução CodeQL pode terminar e aparecer em </w:t>
+      </w:r>
+      <w:r>
+        <w:rPr>
+          <w:b/>
+        </w:rPr>
+        <w:t>Checks</w:t>
+      </w:r>
+      <w:r>
+        <w:t xml:space="preserve"> sem publicar um comentário na Conversation. Quando não há alertas novos no código alterado pelo PR, o resumo do check pode dizer *“No new alerts in code changed by this pull request”* e não ter anotações. Isso significa que aquela análise não encontrou alertas novos nas mudanças do PR; não significa que o CodeQL esteja desligado nem que o repositório inteiro esteja sem alertas.</w:t>
+      </w:r>
+    </w:p>
+    <w:p>
+      <w:r>
+        <w:t xml:space="preserve">Para confirmar uma execução, abra </w:t>
+      </w:r>
+      <w:r>
+        <w:rPr>
+          <w:b/>
+        </w:rPr>
+        <w:t>Checks &gt; CodeQL</w:t>
+      </w:r>
+      <w:r>
+        <w:t xml:space="preserve"> no PR e leia o resumo. Para consultar alertas existentes na branch, use </w:t>
+      </w:r>
+      <w:r>
+        <w:rPr>
+          <w:b/>
+        </w:rPr>
+        <w:t>Security &gt; Code scanning</w:t>
+      </w:r>
+      <w:r>
+        <w:t>. Se houver alertas relacionados às alterações do PR, abra a anotação e confira arquivo, linha e regra. A ausência de comentário na Conversation, isoladamente, não confirma falha da análise.</w:t>
+      </w:r>
+    </w:p>
+    <w:p>
+      <w:r>
+        <w:t xml:space="preserve">No PR </w:t>
+      </w:r>
+      <w:r>
+        <w:t>Restore visual Code Scanning guide for PR contributors — https://github.com/aeroschmidt/scanner-instrument-store/pull/16/checks?check_run_id=114984058749</w:t>
+      </w:r>
+      <w:r>
+        <w:t xml:space="preserve">, o CodeQL terminou com sucesso e registrou *“No new alerts in code changed by this pull request”*. Esse PR altera documentação e imagens, não código-fonte da aplicação; por isso não houve alerta novo nem anotação de código nesse check. O resultado pode ser consultado na execução </w:t>
+      </w:r>
+      <w:r>
+        <w:t>CodeQL do PR — https://github.com/aeroschmidt/scanner-instrument-store/runs/114984058749</w:t>
+      </w:r>
+      <w:r>
+        <w:t>.</w:t>
       </w:r>
     </w:p>
     <w:p>
@@ -1149,7 +1363,93 @@
     </w:p>
     <w:p>
       <w:r>
-        <w:t>O workflow separado .github/workflows/code-scanning-metrics.yml consulta a REST API do GitHub com o GITHUB_TOKEN temporário. Ele não ativa, substitui nem executa o CodeQL. Em push para main, aguarda até dez minutos por uma análise CodeQL que corresponda ao commit da execução. A tarefa diária de métricas apenas registra o estado atual dos alertas e os metadados da análise mais recente; não provoca uma análise CodeQL diária. Para obter um retrato de um PR antes do merge, a mantenedora pode iniciar Actions &gt; Code Scanning metrics &gt; Run workflow, escolher a branch padrão main e informar o número do PR no campo opcional. O script lê os resultados do PR pela API e espera pela análise correspondente; não faz checkout do código do PR. A execução manual em branches diferentes da padrão é bloqueada. As permissões ficam limitadas a security-events: read para consultar alertas/análises, pull-requests: read para buscar metadados do PR e contents: read para ler o script. Não é necessário criar um Personal Access Token nem cadastrar um secret.</w:t>
+        <w:t xml:space="preserve">O workflow separado </w:t>
+      </w:r>
+      <w:r>
+        <w:rPr>
+          <w:rFonts w:ascii="Consolas" w:hAnsi="Consolas"/>
+          <w:color w:val="5B2C83"/>
+          <w:sz w:val="18"/>
+        </w:rPr>
+        <w:t>.github/workflows/code-scanning-metrics.yml</w:t>
+      </w:r>
+      <w:r>
+        <w:t xml:space="preserve"> consulta a REST API do GitHub com o </w:t>
+      </w:r>
+      <w:r>
+        <w:rPr>
+          <w:rFonts w:ascii="Consolas" w:hAnsi="Consolas"/>
+          <w:color w:val="5B2C83"/>
+          <w:sz w:val="18"/>
+        </w:rPr>
+        <w:t>GITHUB_TOKEN</w:t>
+      </w:r>
+      <w:r>
+        <w:t xml:space="preserve"> temporário. Ele não ativa, substitui nem executa o CodeQL. Em push para </w:t>
+      </w:r>
+      <w:r>
+        <w:rPr>
+          <w:rFonts w:ascii="Consolas" w:hAnsi="Consolas"/>
+          <w:color w:val="5B2C83"/>
+          <w:sz w:val="18"/>
+        </w:rPr>
+        <w:t>main</w:t>
+      </w:r>
+      <w:r>
+        <w:t xml:space="preserve">, aguarda até dez minutos por uma análise CodeQL que corresponda ao commit da execução. A tarefa diária de métricas apenas registra o estado atual dos alertas e os metadados da análise mais recente; não provoca uma análise CodeQL diária. Para obter um retrato de um PR antes do merge, a mantenedora pode iniciar </w:t>
+      </w:r>
+      <w:r>
+        <w:rPr>
+          <w:b/>
+        </w:rPr>
+        <w:t>Actions &gt; Code Scanning metrics &gt; Run workflow</w:t>
+      </w:r>
+      <w:r>
+        <w:t xml:space="preserve">, escolher a branch padrão </w:t>
+      </w:r>
+      <w:r>
+        <w:rPr>
+          <w:rFonts w:ascii="Consolas" w:hAnsi="Consolas"/>
+          <w:color w:val="5B2C83"/>
+          <w:sz w:val="18"/>
+        </w:rPr>
+        <w:t>main</w:t>
+      </w:r>
+      <w:r>
+        <w:t xml:space="preserve"> e informar o número do PR no campo opcional. O script lê os resultados do PR pela API e espera pela análise correspondente; não faz checkout do código do PR. A execução manual em branches diferentes da padrão é bloqueada. As permissões ficam limitadas a </w:t>
+      </w:r>
+      <w:r>
+        <w:rPr>
+          <w:rFonts w:ascii="Consolas" w:hAnsi="Consolas"/>
+          <w:color w:val="5B2C83"/>
+          <w:sz w:val="18"/>
+        </w:rPr>
+        <w:t>security-events: read</w:t>
+      </w:r>
+      <w:r>
+        <w:t xml:space="preserve"> para consultar alertas/análises, </w:t>
+      </w:r>
+      <w:r>
+        <w:rPr>
+          <w:rFonts w:ascii="Consolas" w:hAnsi="Consolas"/>
+          <w:color w:val="5B2C83"/>
+          <w:sz w:val="18"/>
+        </w:rPr>
+        <w:t>pull-requests: read</w:t>
+      </w:r>
+      <w:r>
+        <w:t xml:space="preserve"> para buscar metadados do PR e </w:t>
+      </w:r>
+      <w:r>
+        <w:rPr>
+          <w:rFonts w:ascii="Consolas" w:hAnsi="Consolas"/>
+          <w:color w:val="5B2C83"/>
+          <w:sz w:val="18"/>
+        </w:rPr>
+        <w:t>contents: read</w:t>
+      </w:r>
+      <w:r>
+        <w:t xml:space="preserve"> para ler o script. Não é necessário criar um Personal Access Token nem cadastrar um secret.</w:t>
       </w:r>
     </w:p>
     <w:p>
@@ -1162,7 +1462,45 @@
         <w:pStyle w:val="ListNumber"/>
       </w:pPr>
       <w:r>
-        <w:t>Depois que o workflow for mesclado, abra Actions e escolha uma execução de Code Scanning metrics. Para um PR específico, use Run workflow na branch main e informe o número do PR.</w:t>
+        <w:t xml:space="preserve">Depois que o workflow for mesclado, abra </w:t>
+      </w:r>
+      <w:r>
+        <w:rPr>
+          <w:b/>
+        </w:rPr>
+        <w:t>Actions</w:t>
+      </w:r>
+      <w:r>
+        <w:t xml:space="preserve"> e escolha uma execução de </w:t>
+      </w:r>
+      <w:r>
+        <w:rPr>
+          <w:b/>
+        </w:rPr>
+        <w:t>Code Scanning metrics</w:t>
+      </w:r>
+      <w:r>
+        <w:t xml:space="preserve">. Para um PR específico, use </w:t>
+      </w:r>
+      <w:r>
+        <w:rPr>
+          <w:b/>
+        </w:rPr>
+        <w:t>Run workflow</w:t>
+      </w:r>
+      <w:r>
+        <w:t xml:space="preserve"> na branch </w:t>
+      </w:r>
+      <w:r>
+        <w:rPr>
+          <w:rFonts w:ascii="Consolas" w:hAnsi="Consolas"/>
+          <w:color w:val="5B2C83"/>
+          <w:sz w:val="18"/>
+        </w:rPr>
+        <w:t>main</w:t>
+      </w:r>
+      <w:r>
+        <w:t xml:space="preserve"> e informe o número do PR.</w:t>
       </w:r>
     </w:p>
     <w:p>
@@ -1255,7 +1593,40 @@
     </w:p>
     <w:p>
       <w:r>
-        <w:t>O relatório inclui timestamp UTC, branch ou número do PR, commit, link da execução e se a API encontrou uma análise CodeQL associada ao commit atual (analysis.matched_current_execution). Por categoria, a API informa a ferramenta/versão, horário, commit, resultados, regras executadas e uma coluna que sinaliza se aquela categoria corresponde ao commit da execução. Isso permite ver linguagens/categorias e regras reportadas; a API não fornece a quantidade de arquivos-fonte examinados. Se matched_current_execution for false, as categorias listadas são a análise mais recente disponível e não devem ser tratadas como resultado do commit atual. O relatório diário não garante que houve uma análise CodeQL naquele dia.</w:t>
+        <w:t>O relatório inclui timestamp UTC, branch ou número do PR, commit, link da execução e se a API encontrou uma análise CodeQL associada ao commit atual (</w:t>
+      </w:r>
+      <w:r>
+        <w:rPr>
+          <w:rFonts w:ascii="Consolas" w:hAnsi="Consolas"/>
+          <w:color w:val="5B2C83"/>
+          <w:sz w:val="18"/>
+        </w:rPr>
+        <w:t>analysis.matched_current_execution</w:t>
+      </w:r>
+      <w:r>
+        <w:t xml:space="preserve">). Por categoria, a API informa a ferramenta/versão, horário, commit, resultados, regras executadas e uma coluna que sinaliza se aquela categoria corresponde ao commit da execução. Isso permite ver linguagens/categorias e regras reportadas; a API não fornece a quantidade de arquivos-fonte examinados. Se </w:t>
+      </w:r>
+      <w:r>
+        <w:rPr>
+          <w:rFonts w:ascii="Consolas" w:hAnsi="Consolas"/>
+          <w:color w:val="5B2C83"/>
+          <w:sz w:val="18"/>
+        </w:rPr>
+        <w:t>matched_current_execution</w:t>
+      </w:r>
+      <w:r>
+        <w:t xml:space="preserve"> for </w:t>
+      </w:r>
+      <w:r>
+        <w:rPr>
+          <w:rFonts w:ascii="Consolas" w:hAnsi="Consolas"/>
+          <w:color w:val="5B2C83"/>
+          <w:sz w:val="18"/>
+        </w:rPr>
+        <w:t>false</w:t>
+      </w:r>
+      <w:r>
+        <w:t>, as categorias listadas são a análise mais recente disponível e não devem ser tratadas como resultado do commit atual. O relatório diário não garante que houve uma análise CodeQL naquele dia.</w:t>
       </w:r>
     </w:p>
     <w:p>
@@ -1309,12 +1680,109 @@
     </w:p>
     <w:p>
       <w:r>
-        <w:t>Os arquivos não incluem ator, comentário, local do alerta nem identificadores individuais. O artifact fica vinculado à execução e expira após 90 dias (limite máximo configurado para um repositório público). Para preservar histórico por mais tempo, será necessário aprovar outro destino de armazenamento. Se matched_current_execution for false, consulte o check CodeQL correspondente em Actions; o workflow de métricas não lê o resultado interno daquele job gerenciado.</w:t>
+        <w:t xml:space="preserve">Os arquivos não incluem ator, comentário, local do alerta nem identificadores individuais. O artifact fica vinculado à execução e expira após 90 dias (limite máximo configurado para um repositório público). Para preservar histórico por mais tempo, será necessário aprovar outro destino de armazenamento. Se </w:t>
+      </w:r>
+      <w:r>
+        <w:rPr>
+          <w:rFonts w:ascii="Consolas" w:hAnsi="Consolas"/>
+          <w:color w:val="5B2C83"/>
+          <w:sz w:val="18"/>
+        </w:rPr>
+        <w:t>matched_current_execution</w:t>
+      </w:r>
+      <w:r>
+        <w:t xml:space="preserve"> for </w:t>
+      </w:r>
+      <w:r>
+        <w:rPr>
+          <w:rFonts w:ascii="Consolas" w:hAnsi="Consolas"/>
+          <w:color w:val="5B2C83"/>
+          <w:sz w:val="18"/>
+        </w:rPr>
+        <w:t>false</w:t>
+      </w:r>
+      <w:r>
+        <w:t xml:space="preserve">, consulte o check CodeQL correspondente em </w:t>
+      </w:r>
+      <w:r>
+        <w:rPr>
+          <w:b/>
+        </w:rPr>
+        <w:t>Actions</w:t>
+      </w:r>
+      <w:r>
+        <w:t>; o workflow de métricas não lê o resultado interno daquele job gerenciado.</w:t>
       </w:r>
     </w:p>
     <w:p>
       <w:r>
-        <w:t>O script scripts/export_code_scanning_metrics.py percorre as páginas da API, agrega os alertas sem dados pessoais, aguarda a análise atual em pushes e em uma execução manual direcionada a PR, e grava os arquivos mencionados. Para adaptar em outro repositório que usa Default setup, adicione um workflow separado, conceda somente security-events: read e contents: read; inclua pull-requests: read se também consultar metadados de PR. Forneça ${ github.token } como variável de ambiente e publique a pasta criada com actions/upload-artifact. Não coloque o token em linha de comando, arquivo do repositório ou log. O endpoint de análises também requer que Code Scanning esteja disponível no repositório.</w:t>
+        <w:t xml:space="preserve">O script </w:t>
+      </w:r>
+      <w:r>
+        <w:rPr>
+          <w:rFonts w:ascii="Consolas" w:hAnsi="Consolas"/>
+          <w:color w:val="5B2C83"/>
+          <w:sz w:val="18"/>
+        </w:rPr>
+        <w:t>scripts/export_code_scanning_metrics.py</w:t>
+      </w:r>
+      <w:r>
+        <w:t xml:space="preserve"> percorre as páginas da API, agrega os alertas sem dados pessoais, aguarda a análise atual em pushes e em uma execução manual direcionada a PR, e grava os arquivos mencionados. Para adaptar em outro repositório que usa Default setup, adicione um workflow separado, conceda somente </w:t>
+      </w:r>
+      <w:r>
+        <w:rPr>
+          <w:rFonts w:ascii="Consolas" w:hAnsi="Consolas"/>
+          <w:color w:val="5B2C83"/>
+          <w:sz w:val="18"/>
+        </w:rPr>
+        <w:t>security-events: read</w:t>
+      </w:r>
+      <w:r>
+        <w:t xml:space="preserve"> e </w:t>
+      </w:r>
+      <w:r>
+        <w:rPr>
+          <w:rFonts w:ascii="Consolas" w:hAnsi="Consolas"/>
+          <w:color w:val="5B2C83"/>
+          <w:sz w:val="18"/>
+        </w:rPr>
+        <w:t>contents: read</w:t>
+      </w:r>
+      <w:r>
+        <w:t xml:space="preserve">; inclua </w:t>
+      </w:r>
+      <w:r>
+        <w:rPr>
+          <w:rFonts w:ascii="Consolas" w:hAnsi="Consolas"/>
+          <w:color w:val="5B2C83"/>
+          <w:sz w:val="18"/>
+        </w:rPr>
+        <w:t>pull-requests: read</w:t>
+      </w:r>
+      <w:r>
+        <w:t xml:space="preserve"> se também consultar metadados de PR. Forneça </w:t>
+      </w:r>
+      <w:r>
+        <w:rPr>
+          <w:rFonts w:ascii="Consolas" w:hAnsi="Consolas"/>
+          <w:color w:val="5B2C83"/>
+          <w:sz w:val="18"/>
+        </w:rPr>
+        <w:t>${{ github.token }}</w:t>
+      </w:r>
+      <w:r>
+        <w:t xml:space="preserve"> como variável de ambiente e publique a pasta criada com </w:t>
+      </w:r>
+      <w:r>
+        <w:rPr>
+          <w:rFonts w:ascii="Consolas" w:hAnsi="Consolas"/>
+          <w:color w:val="5B2C83"/>
+          <w:sz w:val="18"/>
+        </w:rPr>
+        <w:t>actions/upload-artifact</w:t>
+      </w:r>
+      <w:r>
+        <w:t>. Não coloque o token em linha de comando, arquivo do repositório ou log. O endpoint de análises também requer que Code Scanning esteja disponível no repositório.</w:t>
       </w:r>
     </w:p>
     <w:p>
@@ -1704,7 +2172,7 @@
         <w:pStyle w:val="ListBullet"/>
       </w:pPr>
       <w:r>
-        <w:t>Permissões para o token do workflow — https://docs.github.com/en/actions/security-for-github-actions/security-guides/automatic-token-authentication</w:t>
+        <w:t>Agenda de workflows do GitHub Actions — https://docs.github.com/en/actions/reference/workflows-and-actions/workflow-syntax#onschedule</w:t>
       </w:r>
     </w:p>
     <w:p>
@@ -1712,7 +2180,7 @@
         <w:pStyle w:val="ListBullet"/>
       </w:pPr>
       <w:r>
-        <w:t>Retenção de artifacts do Actions — https://docs.github.com/en/actions/how-tos/manage-workflow-runs/remove-workflow-artifacts</w:t>
+        <w:t>Permissões para o token do workflow — https://docs.github.com/en/actions/security-for-github-actions/security-guides/automatic-token-authentication</w:t>
       </w:r>
     </w:p>
     <w:p>
@@ -1720,6 +2188,14 @@
         <w:pStyle w:val="ListBullet"/>
       </w:pPr>
       <w:r>
+        <w:t>Retenção de artifacts do Actions — https://docs.github.com/en/actions/how-tos/manage-workflow-runs/remove-workflow-artifacts</w:t>
+      </w:r>
+    </w:p>
+    <w:p>
+      <w:pPr>
+        <w:pStyle w:val="ListBullet"/>
+      </w:pPr>
+      <w:r>
         <w:t>Quickstart de segurança do GitHub — https://docs.github.com/en/code-security/getting-started/quickstart-for-securing-your-repository</w:t>
       </w:r>
     </w:p>
@@ -1736,7 +2212,19 @@
         <w:pStyle w:val="ListBullet"/>
       </w:pPr>
       <w:r>
-        <w:t>Historicamente, o CodeQL foi configurado primeiro por Advanced setup; depois, o repositório passou ao Default setup gerenciado pelo GitHub. As execuções históricas estão em CodeQL Advanced #1 — https://github.com/aeroschmidt/scanner-loja-instrumentos/actions/runs/38104871050 e CodeQL Advanced #3 — https://github.com/aeroschmidt/scanner-loja-instrumentos/actions/runs/38105323924.</w:t>
+        <w:t xml:space="preserve">Historicamente, o CodeQL foi configurado primeiro por Advanced setup; depois, o repositório passou ao Default setup gerenciado pelo GitHub. As execuções históricas estão em </w:t>
+      </w:r>
+      <w:r>
+        <w:t>CodeQL Advanced #1 — https://github.com/aeroschmidt/scanner-loja-instrumentos/actions/runs/38104871050</w:t>
+      </w:r>
+      <w:r>
+        <w:t xml:space="preserve"> e </w:t>
+      </w:r>
+      <w:r>
+        <w:t>CodeQL Advanced #3 — https://github.com/aeroschmidt/scanner-loja-instrumentos/actions/runs/38105323924</w:t>
+      </w:r>
+      <w:r>
+        <w:t>.</w:t>
       </w:r>
     </w:p>
     <w:p>
@@ -1766,7 +2254,13 @@
         <w:pStyle w:val="ListBullet"/>
       </w:pPr>
       <w:r>
-        <w:t>A exportação de métricas está sendo preparada no PR #12 — https://github.com/aeroschmidt/scanner-loja-instrumentos/pull/12 — como workflow separado para manter o Default setup. Os artifacts só aparecem após aprovação, merge e execução; cada artifact terá retenção de até 90 dias.</w:t>
+        <w:t xml:space="preserve">A exportação de métricas está sendo preparada no </w:t>
+      </w:r>
+      <w:r>
+        <w:t>PR #12 — https://github.com/aeroschmidt/scanner-loja-instrumentos/pull/12</w:t>
+      </w:r>
+      <w:r>
+        <w:t xml:space="preserve"> como workflow separado para manter o Default setup. Os artifacts só aparecem após aprovação, merge e execução; cada artifact terá retenção de até 90 dias.</w:t>
       </w:r>
     </w:p>
     <w:p>

</xml_diff>